<commit_message>
Fix Motiv parsing with AI and some layout stuff
</commit_message>
<xml_diff>
--- a/templates/doc_template.docx
+++ b/templates/doc_template.docx
@@ -44,10 +44,10 @@
           <wp:anchor distT="0" distB="0" distL="0" distR="0" simplePos="0" relativeHeight="251660288" behindDoc="0" locked="0" layoutInCell="1" allowOverlap="1">
             <wp:simplePos x="0" y="0"/>
             <wp:positionH relativeFrom="column">
-              <wp:posOffset>-635</wp:posOffset>
+              <wp:posOffset>-634</wp:posOffset>
             </wp:positionH>
             <wp:positionV relativeFrom="line">
-              <wp:posOffset>20953</wp:posOffset>
+              <wp:posOffset>20952</wp:posOffset>
             </wp:positionV>
             <wp:extent cx="1098551" cy="981076"/>
             <wp:effectExtent l="0" t="0" r="0" b="0"/>
@@ -67,7 +67,7 @@
                     <a:blip r:embed="rId4">
                       <a:extLst/>
                     </a:blip>
-                    <a:srcRect l="72010" t="4005" r="11351" b="7394"/>
+                    <a:srcRect l="72010" t="4005" r="11350" b="7394"/>
                     <a:stretch>
                       <a:fillRect/>
                     </a:stretch>
@@ -778,9 +778,9 @@
     </w:p>
     <w:tbl>
       <w:tblPr>
-        <w:tblW w:w="10118" w:type="dxa"/>
+        <w:tblW w:w="9902" w:type="dxa"/>
         <w:jc w:val="left"/>
-        <w:tblInd w:w="286" w:type="dxa"/>
+        <w:tblInd w:w="394" w:type="dxa"/>
         <w:tblBorders>
           <w:top w:val="single" w:color="ffffff" w:sz="8" w:space="0" w:shadow="0" w:frame="0"/>
           <w:left w:val="single" w:color="ffffff" w:sz="8" w:space="0" w:shadow="0" w:frame="0"/>
@@ -793,25 +793,25 @@
         <w:tblLayout w:type="fixed"/>
       </w:tblPr>
       <w:tblGrid>
-        <w:gridCol w:w="2692"/>
-        <w:gridCol w:w="4764"/>
-        <w:gridCol w:w="1543"/>
-        <w:gridCol w:w="1119"/>
+        <w:gridCol w:w="2634"/>
+        <w:gridCol w:w="4662"/>
+        <w:gridCol w:w="1510"/>
+        <w:gridCol w:w="1096"/>
       </w:tblGrid>
       <w:tr>
         <w:tblPrEx>
           <w:shd w:val="clear" w:color="auto" w:fill="ced7e7"/>
         </w:tblPrEx>
         <w:trPr>
-          <w:trHeight w:val="310" w:hRule="atLeast"/>
+          <w:trHeight w:val="330" w:hRule="atLeast"/>
         </w:trPr>
         <w:tc>
           <w:tcPr>
-            <w:tcW w:type="dxa" w:w="2692"/>
+            <w:tcW w:type="dxa" w:w="2634"/>
             <w:tcBorders>
               <w:top w:val="single" w:color="000000" w:sz="4" w:space="0" w:shadow="0" w:frame="0"/>
               <w:left w:val="single" w:color="000000" w:sz="4" w:space="0" w:shadow="0" w:frame="0"/>
-              <w:bottom w:val="single" w:color="000000" w:sz="4" w:space="0" w:shadow="0" w:frame="0"/>
+              <w:bottom w:val="single" w:color="a7a7a7" w:sz="4" w:space="0" w:shadow="0" w:frame="0"/>
               <w:right w:val="nil"/>
             </w:tcBorders>
             <w:shd w:val="clear" w:color="auto" w:fill="d9d9d9"/>
@@ -827,11 +827,11 @@
         </w:tc>
         <w:tc>
           <w:tcPr>
-            <w:tcW w:type="dxa" w:w="4764"/>
+            <w:tcW w:type="dxa" w:w="4662"/>
             <w:tcBorders>
               <w:top w:val="single" w:color="7f7f7f" w:sz="8" w:space="0" w:shadow="0" w:frame="0"/>
               <w:left w:val="nil"/>
-              <w:bottom w:val="single" w:color="7f7f7f" w:sz="8" w:space="0" w:shadow="0" w:frame="0"/>
+              <w:bottom w:val="single" w:color="a7a7a7" w:sz="8" w:space="0" w:shadow="0" w:frame="0"/>
               <w:right w:val="single" w:color="7f7f7f" w:sz="8" w:space="0" w:shadow="0" w:frame="0"/>
             </w:tcBorders>
             <w:shd w:val="clear" w:color="auto" w:fill="d9d9d9"/>
@@ -847,12 +847,12 @@
         </w:tc>
         <w:tc>
           <w:tcPr>
-            <w:tcW w:type="dxa" w:w="2662"/>
+            <w:tcW w:type="dxa" w:w="2605"/>
             <w:gridSpan w:val="2"/>
             <w:tcBorders>
               <w:top w:val="single" w:color="000000" w:sz="4" w:space="0" w:shadow="0" w:frame="0"/>
               <w:left w:val="single" w:color="7f7f7f" w:sz="8" w:space="0" w:shadow="0" w:frame="0"/>
-              <w:bottom w:val="single" w:color="000000" w:sz="4" w:space="0" w:shadow="0" w:frame="0"/>
+              <w:bottom w:val="single" w:color="525252" w:sz="4" w:space="0" w:shadow="0" w:frame="0"/>
               <w:right w:val="single" w:color="000000" w:sz="4" w:space="0" w:shadow="0" w:frame="0"/>
             </w:tcBorders>
             <w:shd w:val="clear" w:color="auto" w:fill="d9d9d9"/>
@@ -889,15 +889,15 @@
           <w:shd w:val="clear" w:color="auto" w:fill="ced7e7"/>
         </w:tblPrEx>
         <w:trPr>
-          <w:trHeight w:val="3833" w:hRule="atLeast"/>
+          <w:trHeight w:val="614" w:hRule="atLeast"/>
         </w:trPr>
         <w:tc>
           <w:tcPr>
-            <w:tcW w:type="dxa" w:w="2692"/>
+            <w:tcW w:type="dxa" w:w="2634"/>
             <w:tcBorders>
-              <w:top w:val="single" w:color="000000" w:sz="4" w:space="0" w:shadow="0" w:frame="0"/>
+              <w:top w:val="single" w:color="a7a7a7" w:sz="4" w:space="0" w:shadow="0" w:frame="0"/>
               <w:left w:val="single" w:color="000000" w:sz="4" w:space="0" w:shadow="0" w:frame="0"/>
-              <w:bottom w:val="single" w:color="000000" w:sz="4" w:space="0" w:shadow="0" w:frame="0"/>
+              <w:bottom w:val="single" w:color="ffffff" w:sz="4" w:space="0" w:shadow="0" w:frame="0"/>
               <w:right w:val="nil"/>
             </w:tcBorders>
             <w:shd w:val="clear" w:color="auto" w:fill="ffffff"/>
@@ -916,35 +916,11 @@
                 <w:tab w:val="left" w:pos="1010"/>
                 <w:tab w:val="left" w:pos="1190"/>
               </w:tabs>
-              <w:ind w:left="110" w:hanging="110"/>
-              <w:rPr>
-                <w:b w:val="1"/>
-                <w:bCs w:val="1"/>
-                <w:sz w:val="20"/>
-                <w:szCs w:val="20"/>
-                <w:u w:val="single"/>
-                <w:shd w:val="nil" w:color="auto" w:fill="auto"/>
-                <w:lang w:val="de-DE"/>
-              </w:rPr>
-            </w:pPr>
-          </w:p>
-          <w:p>
-            <w:pPr>
-              <w:pStyle w:val="Textkörper"/>
-              <w:tabs>
-                <w:tab w:val="left" w:pos="1010"/>
-                <w:tab w:val="left" w:pos="1190"/>
-              </w:tabs>
               <w:bidi w:val="0"/>
               <w:spacing w:line="360" w:lineRule="auto"/>
               <w:ind w:left="110" w:right="0" w:hanging="110"/>
               <w:jc w:val="left"/>
               <w:rPr>
-                <w:b w:val="1"/>
-                <w:bCs w:val="1"/>
-                <w:sz w:val="20"/>
-                <w:szCs w:val="20"/>
-                <w:shd w:val="nil" w:color="auto" w:fill="auto"/>
                 <w:rtl w:val="0"/>
               </w:rPr>
             </w:pPr>
@@ -977,108 +953,25 @@
               <w:tab/>
               <w:t xml:space="preserve">         </w:t>
             </w:r>
-          </w:p>
-          <w:p>
-            <w:pPr>
-              <w:pStyle w:val="Textkörper"/>
-              <w:tabs>
-                <w:tab w:val="left" w:pos="1010"/>
-                <w:tab w:val="left" w:pos="1190"/>
-                <w:tab w:val="left" w:pos="1370"/>
-              </w:tabs>
-              <w:bidi w:val="0"/>
-              <w:spacing w:line="360" w:lineRule="auto"/>
-              <w:ind w:left="110" w:right="0" w:hanging="110"/>
-              <w:jc w:val="left"/>
+            <w:r>
               <w:rPr>
                 <w:b w:val="1"/>
                 <w:bCs w:val="1"/>
                 <w:sz w:val="20"/>
                 <w:szCs w:val="20"/>
                 <w:shd w:val="nil" w:color="auto" w:fill="auto"/>
-                <w:rtl w:val="0"/>
-              </w:rPr>
-            </w:pPr>
-            <w:r>
-              <w:rPr>
-                <w:b w:val="1"/>
-                <w:bCs w:val="1"/>
-                <w:sz w:val="20"/>
-                <w:szCs w:val="20"/>
-                <w:u w:val="single"/>
-                <w:shd w:val="nil" w:color="auto" w:fill="auto"/>
-                <w:rtl w:val="0"/>
-                <w:lang w:val="de-DE"/>
-              </w:rPr>
-              <w:t>Anschrift:</w:t>
-            </w:r>
-            <w:r>
-              <w:rPr>
-                <w:b w:val="1"/>
-                <w:bCs w:val="1"/>
-                <w:sz w:val="20"/>
-                <w:szCs w:val="20"/>
-                <w:shd w:val="nil" w:color="auto" w:fill="auto"/>
-                <w:rtl w:val="0"/>
-                <w:lang w:val="de-DE"/>
-              </w:rPr>
-              <w:t xml:space="preserve">    </w:t>
-              <w:tab/>
-              <w:tab/>
-              <w:t xml:space="preserve">          </w:t>
-            </w:r>
-          </w:p>
-          <w:p>
-            <w:pPr>
-              <w:pStyle w:val="Textkörper"/>
-              <w:tabs>
-                <w:tab w:val="left" w:pos="1010"/>
-                <w:tab w:val="left" w:pos="1190"/>
-                <w:tab w:val="left" w:pos="1370"/>
-              </w:tabs>
-              <w:bidi w:val="0"/>
-              <w:spacing w:line="360" w:lineRule="auto"/>
-              <w:ind w:left="110" w:right="0" w:hanging="110"/>
-              <w:jc w:val="left"/>
-              <w:rPr>
-                <w:rtl w:val="0"/>
-              </w:rPr>
-            </w:pPr>
-            <w:r>
-              <w:rPr>
-                <w:b w:val="1"/>
-                <w:bCs w:val="1"/>
-                <w:sz w:val="20"/>
-                <w:szCs w:val="20"/>
-                <w:u w:val="single"/>
-                <w:shd w:val="nil" w:color="auto" w:fill="auto"/>
-                <w:rtl w:val="0"/>
-                <w:lang w:val="de-DE"/>
-              </w:rPr>
-              <w:t>Ansprechpartnerin:</w:t>
-            </w:r>
-            <w:r>
-              <w:rPr>
-                <w:b w:val="1"/>
-                <w:bCs w:val="1"/>
-                <w:sz w:val="20"/>
-                <w:szCs w:val="20"/>
-                <w:shd w:val="nil" w:color="auto" w:fill="auto"/>
-                <w:rtl w:val="0"/>
-                <w:lang w:val="de-DE"/>
-              </w:rPr>
-              <w:t xml:space="preserve">   </w:t>
+              </w:rPr>
             </w:r>
           </w:p>
         </w:tc>
         <w:tc>
           <w:tcPr>
-            <w:tcW w:type="dxa" w:w="4764"/>
+            <w:tcW w:type="dxa" w:w="4662"/>
             <w:tcBorders>
-              <w:top w:val="single" w:color="7f7f7f" w:sz="8" w:space="0" w:shadow="0" w:frame="0"/>
+              <w:top w:val="single" w:color="a7a7a7" w:sz="8" w:space="0" w:shadow="0" w:frame="0"/>
               <w:left w:val="nil"/>
-              <w:bottom w:val="single" w:color="7f7f7f" w:sz="8" w:space="0" w:shadow="0" w:frame="0"/>
-              <w:right w:val="single" w:color="7f7f7f" w:sz="8" w:space="0" w:shadow="0" w:frame="0"/>
+              <w:bottom w:val="single" w:color="ffffff" w:sz="8" w:space="0" w:shadow="0" w:frame="0"/>
+              <w:right w:val="single" w:color="a7a7a7" w:sz="8" w:space="0" w:shadow="0" w:frame="0"/>
             </w:tcBorders>
             <w:shd w:val="clear" w:color="auto" w:fill="ffffff"/>
             <w:tcMar>
@@ -1091,30 +984,6 @@
           </w:tcPr>
           <w:p>
             <w:pPr>
-              <w:pStyle w:val="Body"/>
-              <w:tabs>
-                <w:tab w:val="left" w:pos="1010"/>
-                <w:tab w:val="left" w:pos="1190"/>
-              </w:tabs>
-              <w:ind w:left="110" w:hanging="110"/>
-              <w:rPr>
-                <w:rFonts w:ascii="Arial" w:cs="Arial" w:hAnsi="Arial" w:eastAsia="Arial"/>
-                <w:b w:val="1"/>
-                <w:bCs w:val="1"/>
-                <w:sz w:val="20"/>
-                <w:szCs w:val="20"/>
-                <w:u w:val="single"/>
-                <w:shd w:val="nil" w:color="auto" w:fill="auto"/>
-                <w:lang w:val="en-US"/>
-                <w14:textOutline w14:w="12700" w14:cap="flat">
-                  <w14:noFill/>
-                  <w14:miter w14:lim="400000"/>
-                </w14:textOutline>
-              </w:rPr>
-            </w:pPr>
-          </w:p>
-          <w:p>
-            <w:pPr>
               <w:pStyle w:val="Textkörper"/>
               <w:tabs>
                 <w:tab w:val="left" w:pos="1010"/>
@@ -1125,14 +994,21 @@
               <w:ind w:left="110" w:right="0" w:hanging="110"/>
               <w:jc w:val="left"/>
               <w:rPr>
+                <w:rtl w:val="0"/>
+              </w:rPr>
+            </w:pPr>
+            <w:r>
+              <w:rPr>
                 <w:b w:val="1"/>
                 <w:bCs w:val="1"/>
                 <w:sz w:val="20"/>
                 <w:szCs w:val="20"/>
                 <w:shd w:val="nil" w:color="auto" w:fill="auto"/>
                 <w:rtl w:val="0"/>
-              </w:rPr>
-            </w:pPr>
+                <w:lang w:val="en-US"/>
+              </w:rPr>
+              <w:t>$</w:t>
+            </w:r>
             <w:r>
               <w:rPr>
                 <w:b w:val="1"/>
@@ -1143,313 +1019,18 @@
                 <w:rtl w:val="0"/>
                 <w:lang w:val="en-US"/>
               </w:rPr>
-              <w:t>$</w:t>
-            </w:r>
-            <w:r>
-              <w:rPr>
-                <w:b w:val="1"/>
-                <w:bCs w:val="1"/>
-                <w:sz w:val="20"/>
-                <w:szCs w:val="20"/>
-                <w:shd w:val="nil" w:color="auto" w:fill="auto"/>
-                <w:rtl w:val="0"/>
-                <w:lang w:val="en-US"/>
-              </w:rPr>
               <w:t>{ort}</w:t>
-            </w:r>
-          </w:p>
-          <w:p>
-            <w:pPr>
-              <w:pStyle w:val="Textkörper"/>
-              <w:tabs>
-                <w:tab w:val="left" w:pos="1010"/>
-                <w:tab w:val="left" w:pos="1190"/>
-                <w:tab w:val="left" w:pos="1370"/>
-              </w:tabs>
-              <w:bidi w:val="0"/>
-              <w:spacing w:line="360" w:lineRule="auto"/>
-              <w:ind w:left="110" w:right="0" w:hanging="110"/>
-              <w:jc w:val="left"/>
-              <w:rPr>
-                <w:b w:val="1"/>
-                <w:bCs w:val="1"/>
-                <w:sz w:val="20"/>
-                <w:szCs w:val="20"/>
-                <w:shd w:val="nil" w:color="auto" w:fill="auto"/>
-                <w:rtl w:val="0"/>
-              </w:rPr>
-            </w:pPr>
-            <w:r>
-              <w:rPr>
-                <w:b w:val="1"/>
-                <w:bCs w:val="1"/>
-                <w:sz w:val="20"/>
-                <w:szCs w:val="20"/>
-                <w:shd w:val="nil" w:color="auto" w:fill="auto"/>
-                <w:rtl w:val="0"/>
-                <w:lang w:val="en-US"/>
-              </w:rPr>
-              <w:t>$</w:t>
-            </w:r>
-            <w:r>
-              <w:rPr>
-                <w:b w:val="1"/>
-                <w:bCs w:val="1"/>
-                <w:sz w:val="20"/>
-                <w:szCs w:val="20"/>
-                <w:shd w:val="nil" w:color="auto" w:fill="auto"/>
-                <w:rtl w:val="0"/>
-                <w:lang w:val="en-US"/>
-              </w:rPr>
-              <w:t>{addresse}</w:t>
-            </w:r>
-          </w:p>
-          <w:p>
-            <w:pPr>
-              <w:pStyle w:val="Textkörper"/>
-              <w:tabs>
-                <w:tab w:val="left" w:pos="1010"/>
-                <w:tab w:val="left" w:pos="1190"/>
-                <w:tab w:val="left" w:pos="1370"/>
-              </w:tabs>
-              <w:bidi w:val="0"/>
-              <w:spacing w:line="360" w:lineRule="auto"/>
-              <w:ind w:left="110" w:right="0" w:hanging="110"/>
-              <w:jc w:val="left"/>
-              <w:rPr>
-                <w:b w:val="1"/>
-                <w:bCs w:val="1"/>
-                <w:sz w:val="20"/>
-                <w:szCs w:val="20"/>
-                <w:shd w:val="nil" w:color="auto" w:fill="auto"/>
-                <w:rtl w:val="0"/>
-              </w:rPr>
-            </w:pPr>
-            <w:r>
-              <w:rPr>
-                <w:b w:val="1"/>
-                <w:bCs w:val="1"/>
-                <w:sz w:val="20"/>
-                <w:szCs w:val="20"/>
-                <w:shd w:val="nil" w:color="auto" w:fill="auto"/>
-                <w:rtl w:val="0"/>
-                <w:lang w:val="en-US"/>
-              </w:rPr>
-              <w:t>$</w:t>
-            </w:r>
-            <w:r>
-              <w:rPr>
-                <w:b w:val="1"/>
-                <w:bCs w:val="1"/>
-                <w:sz w:val="20"/>
-                <w:szCs w:val="20"/>
-                <w:shd w:val="nil" w:color="auto" w:fill="auto"/>
-                <w:rtl w:val="0"/>
-                <w:lang w:val="en-US"/>
-              </w:rPr>
-              <w:t>{</w:t>
-            </w:r>
-            <w:r>
-              <w:rPr>
-                <w:b w:val="1"/>
-                <w:bCs w:val="1"/>
-                <w:sz w:val="20"/>
-                <w:szCs w:val="20"/>
-                <w:shd w:val="nil" w:color="auto" w:fill="auto"/>
-                <w:rtl w:val="0"/>
-                <w:lang w:val="de-DE"/>
-              </w:rPr>
-              <w:t>Ansprechpartnerin</w:t>
-            </w:r>
-            <w:r>
-              <w:rPr>
-                <w:b w:val="1"/>
-                <w:bCs w:val="1"/>
-                <w:sz w:val="20"/>
-                <w:szCs w:val="20"/>
-                <w:shd w:val="nil" w:color="auto" w:fill="auto"/>
-                <w:rtl w:val="0"/>
-                <w:lang w:val="en-US"/>
-              </w:rPr>
-              <w:t>}</w:t>
-            </w:r>
-          </w:p>
-          <w:p>
-            <w:pPr>
-              <w:pStyle w:val="Textkörper"/>
-              <w:tabs>
-                <w:tab w:val="left" w:pos="1010"/>
-                <w:tab w:val="left" w:pos="1190"/>
-                <w:tab w:val="left" w:pos="1370"/>
-              </w:tabs>
-              <w:bidi w:val="0"/>
-              <w:spacing w:line="360" w:lineRule="auto"/>
-              <w:ind w:left="110" w:right="0" w:hanging="110"/>
-              <w:jc w:val="left"/>
-              <w:rPr>
-                <w:b w:val="1"/>
-                <w:bCs w:val="1"/>
-                <w:sz w:val="20"/>
-                <w:szCs w:val="20"/>
-                <w:shd w:val="nil" w:color="auto" w:fill="auto"/>
-                <w:rtl w:val="0"/>
-              </w:rPr>
-            </w:pPr>
-            <w:r>
-              <w:rPr>
-                <w:b w:val="0"/>
-                <w:bCs w:val="0"/>
-                <w:sz w:val="20"/>
-                <w:szCs w:val="20"/>
-                <w:shd w:val="nil" w:color="auto" w:fill="auto"/>
-                <w:rtl w:val="0"/>
-                <w:lang w:val="de-DE"/>
-              </w:rPr>
-              <w:t>Tel.:</w:t>
-            </w:r>
-            <w:r>
-              <w:rPr>
-                <w:b w:val="0"/>
-                <w:bCs w:val="0"/>
-                <w:sz w:val="20"/>
-                <w:szCs w:val="20"/>
-                <w:shd w:val="nil" w:color="auto" w:fill="auto"/>
-                <w:rtl w:val="0"/>
-                <w:lang w:val="en-US"/>
-              </w:rPr>
-              <w:t xml:space="preserve"> </w:t>
-            </w:r>
-            <w:r>
-              <w:rPr>
-                <w:b w:val="0"/>
-                <w:bCs w:val="0"/>
-                <w:sz w:val="20"/>
-                <w:szCs w:val="20"/>
-                <w:shd w:val="nil" w:color="auto" w:fill="auto"/>
-                <w:rtl w:val="0"/>
-                <w:lang w:val="en-US"/>
-              </w:rPr>
-              <w:t>$</w:t>
-            </w:r>
-            <w:r>
-              <w:rPr>
-                <w:b w:val="1"/>
-                <w:bCs w:val="1"/>
-                <w:sz w:val="20"/>
-                <w:szCs w:val="20"/>
-                <w:shd w:val="nil" w:color="auto" w:fill="auto"/>
-                <w:rtl w:val="0"/>
-                <w:lang w:val="en-US"/>
-              </w:rPr>
-              <w:t>{</w:t>
-            </w:r>
-            <w:r>
-              <w:rPr>
-                <w:b w:val="1"/>
-                <w:bCs w:val="1"/>
-                <w:sz w:val="20"/>
-                <w:szCs w:val="20"/>
-                <w:shd w:val="nil" w:color="auto" w:fill="auto"/>
-                <w:rtl w:val="0"/>
-                <w:lang w:val="de-DE"/>
-              </w:rPr>
-              <w:t>Ansprechpartnerin</w:t>
-            </w:r>
-            <w:r>
-              <w:rPr>
-                <w:b w:val="1"/>
-                <w:bCs w:val="1"/>
-                <w:sz w:val="20"/>
-                <w:szCs w:val="20"/>
-                <w:shd w:val="nil" w:color="auto" w:fill="auto"/>
-                <w:rtl w:val="0"/>
-                <w:lang w:val="en-US"/>
-              </w:rPr>
-              <w:t>_tel}</w:t>
-            </w:r>
-          </w:p>
-          <w:p>
-            <w:pPr>
-              <w:pStyle w:val="Textkörper"/>
-              <w:tabs>
-                <w:tab w:val="left" w:pos="1010"/>
-                <w:tab w:val="left" w:pos="1190"/>
-                <w:tab w:val="left" w:pos="1370"/>
-              </w:tabs>
-              <w:bidi w:val="0"/>
-              <w:spacing w:line="360" w:lineRule="auto"/>
-              <w:ind w:left="110" w:right="0" w:hanging="110"/>
-              <w:jc w:val="left"/>
-              <w:rPr>
-                <w:rtl w:val="0"/>
-              </w:rPr>
-            </w:pPr>
-            <w:r>
-              <w:rPr>
-                <w:sz w:val="20"/>
-                <w:szCs w:val="20"/>
-                <w:shd w:val="nil" w:color="auto" w:fill="auto"/>
-                <w:rtl w:val="0"/>
-                <w:lang w:val="en-US"/>
-              </w:rPr>
-              <w:t xml:space="preserve">Mail: </w:t>
-            </w:r>
-            <w:r>
-              <w:rPr>
-                <w:sz w:val="20"/>
-                <w:szCs w:val="20"/>
-                <w:shd w:val="nil" w:color="auto" w:fill="auto"/>
-                <w:rtl w:val="0"/>
-                <w:lang w:val="en-US"/>
-              </w:rPr>
-              <w:t>$</w:t>
-            </w:r>
-            <w:r>
-              <w:rPr>
-                <w:b w:val="1"/>
-                <w:bCs w:val="1"/>
-                <w:sz w:val="20"/>
-                <w:szCs w:val="20"/>
-                <w:shd w:val="nil" w:color="auto" w:fill="auto"/>
-                <w:rtl w:val="0"/>
-                <w:lang w:val="en-US"/>
-              </w:rPr>
-              <w:t>{</w:t>
-            </w:r>
-            <w:r>
-              <w:rPr>
-                <w:b w:val="1"/>
-                <w:bCs w:val="1"/>
-                <w:sz w:val="20"/>
-                <w:szCs w:val="20"/>
-                <w:shd w:val="nil" w:color="auto" w:fill="auto"/>
-                <w:rtl w:val="0"/>
-                <w:lang w:val="de-DE"/>
-              </w:rPr>
-              <w:t>Ansprechpartnerin</w:t>
-            </w:r>
-            <w:r>
-              <w:rPr>
-                <w:b w:val="1"/>
-                <w:bCs w:val="1"/>
-                <w:sz w:val="20"/>
-                <w:szCs w:val="20"/>
-                <w:shd w:val="nil" w:color="auto" w:fill="auto"/>
-                <w:rtl w:val="0"/>
-                <w:lang w:val="en-US"/>
-              </w:rPr>
-              <w:t>_mail}</w:t>
             </w:r>
           </w:p>
         </w:tc>
         <w:tc>
           <w:tcPr>
-            <w:tcW w:type="dxa" w:w="1543"/>
+            <w:tcW w:type="dxa" w:w="1510"/>
             <w:tcBorders>
-              <w:top w:val="single" w:color="000000" w:sz="4" w:space="0" w:shadow="0" w:frame="0"/>
-              <w:left w:val="single" w:color="7f7f7f" w:sz="8" w:space="0" w:shadow="0" w:frame="0"/>
-              <w:bottom w:val="single" w:color="000000" w:sz="4" w:space="0" w:shadow="0" w:frame="0"/>
-              <w:right w:val="single" w:color="000000" w:sz="4" w:space="0" w:shadow="0" w:frame="0"/>
+              <w:top w:val="single" w:color="525252" w:sz="4" w:space="0" w:shadow="0" w:frame="0"/>
+              <w:left w:val="single" w:color="a7a7a7" w:sz="8" w:space="0" w:shadow="0" w:frame="0"/>
+              <w:bottom w:val="single" w:color="ffffff" w:sz="4" w:space="0" w:shadow="0" w:frame="0"/>
+              <w:right w:val="single" w:color="ffffff" w:sz="4" w:space="0" w:shadow="0" w:frame="0"/>
             </w:tcBorders>
             <w:shd w:val="clear" w:color="auto" w:fill="auto"/>
             <w:tcMar>
@@ -1560,301 +1141,202 @@
               <w:ind w:left="0" w:right="0" w:firstLine="0"/>
               <w:jc w:val="left"/>
               <w:rPr>
-                <w:rFonts w:ascii="Arial" w:cs="Arial" w:hAnsi="Arial" w:eastAsia="Arial"/>
+                <w:rtl w:val="0"/>
+              </w:rPr>
+            </w:pPr>
+            <w:r>
+              <w:rPr>
+                <w:rFonts w:ascii="Arial" w:hAnsi="Arial"/>
                 <w:b w:val="1"/>
                 <w:bCs w:val="1"/>
                 <w:sz w:val="18"/>
                 <w:szCs w:val="18"/>
                 <w:shd w:val="nil" w:color="auto" w:fill="auto"/>
                 <w:rtl w:val="0"/>
-              </w:rPr>
-            </w:pPr>
-            <w:r>
-              <w:rPr>
-                <w:rFonts w:ascii="Arial" w:hAnsi="Arial"/>
-                <w:b w:val="1"/>
-                <w:bCs w:val="1"/>
-                <w:sz w:val="18"/>
-                <w:szCs w:val="18"/>
-                <w:shd w:val="nil" w:color="auto" w:fill="auto"/>
-                <w:rtl w:val="0"/>
                 <w:lang w:val="de-DE"/>
               </w:rPr>
               <w:t>Redaktion:</w:t>
-            </w:r>
-          </w:p>
-          <w:p>
-            <w:pPr>
-              <w:pStyle w:val="AB"/>
-              <w:bidi w:val="0"/>
-              <w:spacing w:line="240" w:lineRule="auto"/>
-              <w:ind w:left="0" w:right="0" w:firstLine="0"/>
-              <w:jc w:val="left"/>
-              <w:rPr>
-                <w:rFonts w:ascii="Arial" w:cs="Arial" w:hAnsi="Arial" w:eastAsia="Arial"/>
-                <w:b w:val="1"/>
-                <w:bCs w:val="1"/>
-                <w:sz w:val="18"/>
-                <w:szCs w:val="18"/>
-                <w:shd w:val="nil" w:color="auto" w:fill="auto"/>
-                <w:rtl w:val="0"/>
-              </w:rPr>
-            </w:pPr>
-            <w:r>
-              <w:rPr>
-                <w:rFonts w:ascii="Arial" w:hAnsi="Arial"/>
-                <w:b w:val="1"/>
-                <w:bCs w:val="1"/>
-                <w:sz w:val="18"/>
-                <w:szCs w:val="18"/>
-                <w:shd w:val="nil" w:color="auto" w:fill="auto"/>
-                <w:rtl w:val="0"/>
-                <w:lang w:val="de-DE"/>
-              </w:rPr>
-              <w:t>Ton:</w:t>
-            </w:r>
-          </w:p>
-          <w:p>
-            <w:pPr>
-              <w:pStyle w:val="Standard"/>
-              <w:bidi w:val="0"/>
-              <w:ind w:left="0" w:right="0" w:firstLine="0"/>
-              <w:jc w:val="left"/>
-              <w:rPr>
-                <w:rFonts w:ascii="Arial" w:cs="Arial" w:hAnsi="Arial" w:eastAsia="Arial"/>
-                <w:b w:val="1"/>
-                <w:bCs w:val="1"/>
-                <w:sz w:val="18"/>
-                <w:szCs w:val="18"/>
-                <w:shd w:val="nil" w:color="auto" w:fill="auto"/>
-                <w:rtl w:val="0"/>
-              </w:rPr>
-            </w:pPr>
-            <w:r>
-              <w:rPr>
-                <w:rFonts w:ascii="Arial" w:hAnsi="Arial"/>
-                <w:b w:val="1"/>
-                <w:bCs w:val="1"/>
-                <w:sz w:val="18"/>
-                <w:szCs w:val="18"/>
-                <w:shd w:val="nil" w:color="auto" w:fill="auto"/>
-                <w:rtl w:val="0"/>
-                <w:lang w:val="de-DE"/>
-              </w:rPr>
-              <w:t>Kamera:</w:t>
-            </w:r>
-          </w:p>
-          <w:p>
-            <w:pPr>
-              <w:pStyle w:val="Standard"/>
-              <w:rPr>
-                <w:rFonts w:ascii="Arial" w:cs="Arial" w:hAnsi="Arial" w:eastAsia="Arial"/>
-                <w:b w:val="1"/>
-                <w:bCs w:val="1"/>
-                <w:sz w:val="18"/>
-                <w:szCs w:val="18"/>
-                <w:shd w:val="nil" w:color="auto" w:fill="auto"/>
-                <w:lang w:val="de-DE"/>
-              </w:rPr>
-            </w:pPr>
-          </w:p>
-          <w:p>
-            <w:pPr>
-              <w:pStyle w:val="Standard"/>
-              <w:bidi w:val="0"/>
-              <w:ind w:left="0" w:right="0" w:firstLine="0"/>
-              <w:jc w:val="left"/>
-              <w:rPr>
-                <w:rFonts w:ascii="Arial" w:cs="Arial" w:hAnsi="Arial" w:eastAsia="Arial"/>
-                <w:b w:val="1"/>
-                <w:bCs w:val="1"/>
-                <w:i w:val="1"/>
-                <w:iCs w:val="1"/>
-                <w:sz w:val="18"/>
-                <w:szCs w:val="18"/>
-                <w:shd w:val="nil" w:color="auto" w:fill="auto"/>
-                <w:rtl w:val="0"/>
-              </w:rPr>
-            </w:pPr>
-            <w:r>
-              <w:rPr>
-                <w:rFonts w:ascii="Arial" w:hAnsi="Arial"/>
-                <w:b w:val="1"/>
-                <w:bCs w:val="1"/>
-                <w:i w:val="1"/>
-                <w:iCs w:val="1"/>
-                <w:sz w:val="18"/>
-                <w:szCs w:val="18"/>
-                <w:shd w:val="nil" w:color="auto" w:fill="auto"/>
-                <w:rtl w:val="0"/>
-                <w:lang w:val="de-DE"/>
-              </w:rPr>
-              <w:t>Treff Motiv</w:t>
-            </w:r>
-          </w:p>
-          <w:p>
-            <w:pPr>
-              <w:pStyle w:val="Standard"/>
-              <w:bidi w:val="0"/>
-              <w:ind w:left="0" w:right="0" w:firstLine="0"/>
-              <w:jc w:val="left"/>
-              <w:rPr>
-                <w:rFonts w:ascii="Arial" w:cs="Arial" w:hAnsi="Arial" w:eastAsia="Arial"/>
-                <w:b w:val="1"/>
-                <w:bCs w:val="1"/>
-                <w:sz w:val="18"/>
-                <w:szCs w:val="18"/>
-                <w:shd w:val="nil" w:color="auto" w:fill="auto"/>
-                <w:rtl w:val="0"/>
-              </w:rPr>
-            </w:pPr>
-            <w:r>
-              <w:rPr>
-                <w:rFonts w:ascii="Arial" w:hAnsi="Arial"/>
-                <w:b w:val="1"/>
-                <w:bCs w:val="1"/>
-                <w:sz w:val="18"/>
-                <w:szCs w:val="18"/>
-                <w:shd w:val="nil" w:color="auto" w:fill="auto"/>
-                <w:rtl w:val="0"/>
-                <w:lang w:val="de-DE"/>
-              </w:rPr>
-              <w:t>Protagonistin:</w:t>
-            </w:r>
-          </w:p>
-          <w:p>
-            <w:pPr>
-              <w:pStyle w:val="Standard"/>
-              <w:rPr>
-                <w:rFonts w:ascii="Arial" w:cs="Arial" w:hAnsi="Arial" w:eastAsia="Arial"/>
-                <w:b w:val="1"/>
-                <w:bCs w:val="1"/>
-                <w:sz w:val="18"/>
-                <w:szCs w:val="18"/>
-                <w:shd w:val="nil" w:color="auto" w:fill="auto"/>
-                <w:lang w:val="de-DE"/>
-              </w:rPr>
-            </w:pPr>
-          </w:p>
-          <w:p>
-            <w:pPr>
-              <w:pStyle w:val="Standard"/>
-              <w:bidi w:val="0"/>
-              <w:ind w:left="0" w:right="0" w:firstLine="0"/>
-              <w:jc w:val="left"/>
-              <w:rPr>
-                <w:rFonts w:ascii="Arial" w:cs="Arial" w:hAnsi="Arial" w:eastAsia="Arial"/>
-                <w:b w:val="1"/>
-                <w:bCs w:val="1"/>
-                <w:sz w:val="18"/>
-                <w:szCs w:val="18"/>
-                <w:shd w:val="nil" w:color="auto" w:fill="auto"/>
-                <w:rtl w:val="0"/>
-              </w:rPr>
-            </w:pPr>
-            <w:r>
-              <w:rPr>
-                <w:rFonts w:ascii="Arial" w:hAnsi="Arial"/>
-                <w:b w:val="1"/>
-                <w:bCs w:val="1"/>
-                <w:sz w:val="18"/>
-                <w:szCs w:val="18"/>
-                <w:shd w:val="nil" w:color="auto" w:fill="auto"/>
-                <w:rtl w:val="0"/>
-                <w:lang w:val="de-DE"/>
-              </w:rPr>
-              <w:t>Drehbeginn:</w:t>
-            </w:r>
-          </w:p>
-          <w:p>
-            <w:pPr>
-              <w:pStyle w:val="Standard"/>
-              <w:rPr>
-                <w:rFonts w:ascii="Arial" w:cs="Arial" w:hAnsi="Arial" w:eastAsia="Arial"/>
-                <w:b w:val="1"/>
-                <w:bCs w:val="1"/>
-                <w:sz w:val="18"/>
-                <w:szCs w:val="18"/>
-                <w:shd w:val="nil" w:color="auto" w:fill="auto"/>
-                <w:lang w:val="de-DE"/>
-              </w:rPr>
-            </w:pPr>
-          </w:p>
-          <w:p>
-            <w:pPr>
-              <w:pStyle w:val="Standard"/>
-              <w:bidi w:val="0"/>
-              <w:ind w:left="0" w:right="0" w:firstLine="0"/>
-              <w:jc w:val="left"/>
-              <w:rPr>
-                <w:rFonts w:ascii="Arial" w:cs="Arial" w:hAnsi="Arial" w:eastAsia="Arial"/>
-                <w:b w:val="1"/>
-                <w:bCs w:val="1"/>
-                <w:sz w:val="18"/>
-                <w:szCs w:val="18"/>
-                <w:shd w:val="nil" w:color="auto" w:fill="auto"/>
-                <w:rtl w:val="0"/>
-              </w:rPr>
-            </w:pPr>
-            <w:r>
-              <w:rPr>
-                <w:rFonts w:ascii="Arial" w:hAnsi="Arial"/>
-                <w:b w:val="1"/>
-                <w:bCs w:val="1"/>
-                <w:sz w:val="18"/>
-                <w:szCs w:val="18"/>
-                <w:shd w:val="nil" w:color="auto" w:fill="auto"/>
-                <w:rtl w:val="0"/>
-                <w:lang w:val="de-DE"/>
-              </w:rPr>
-              <w:t>Drehschluss ca. :</w:t>
-            </w:r>
-          </w:p>
-          <w:p>
-            <w:pPr>
-              <w:pStyle w:val="Standard"/>
-              <w:rPr>
-                <w:rFonts w:ascii="Arial" w:cs="Arial" w:hAnsi="Arial" w:eastAsia="Arial"/>
-                <w:b w:val="1"/>
-                <w:bCs w:val="1"/>
-                <w:shd w:val="nil" w:color="auto" w:fill="auto"/>
-                <w:lang w:val="de-DE"/>
-              </w:rPr>
-            </w:pPr>
-          </w:p>
-          <w:p>
-            <w:pPr>
-              <w:pStyle w:val="Standard"/>
-              <w:bidi w:val="0"/>
-              <w:ind w:left="0" w:right="0" w:firstLine="0"/>
-              <w:jc w:val="left"/>
-              <w:rPr>
-                <w:rtl w:val="0"/>
-              </w:rPr>
-            </w:pPr>
-            <w:r>
-              <w:rPr>
-                <w:rFonts w:ascii="Arial" w:hAnsi="Arial"/>
-                <w:b w:val="1"/>
-                <w:bCs w:val="1"/>
-                <w:sz w:val="18"/>
-                <w:szCs w:val="18"/>
-                <w:shd w:val="nil" w:color="auto" w:fill="auto"/>
-                <w:rtl w:val="0"/>
-                <w:lang w:val="de-DE"/>
-              </w:rPr>
-              <w:t>Arbeitsende ca.:</w:t>
             </w:r>
           </w:p>
         </w:tc>
         <w:tc>
           <w:tcPr>
-            <w:tcW w:type="dxa" w:w="1119"/>
+            <w:tcW w:type="dxa" w:w="1095"/>
             <w:tcBorders>
-              <w:top w:val="single" w:color="000000" w:sz="4" w:space="0" w:shadow="0" w:frame="0"/>
+              <w:top w:val="single" w:color="525252" w:sz="4" w:space="0" w:shadow="0" w:frame="0"/>
+              <w:left w:val="single" w:color="ffffff" w:sz="4" w:space="0" w:shadow="0" w:frame="0"/>
+              <w:bottom w:val="single" w:color="ffffff" w:sz="4" w:space="0" w:shadow="0" w:frame="0"/>
+              <w:right w:val="single" w:color="525252" w:sz="4" w:space="0" w:shadow="0" w:frame="0"/>
+            </w:tcBorders>
+            <w:shd w:val="clear" w:color="auto" w:fill="auto"/>
+            <w:tcMar>
+              <w:top w:type="dxa" w:w="80"/>
+              <w:left w:type="dxa" w:w="80"/>
+              <w:bottom w:type="dxa" w:w="80"/>
+              <w:right w:type="dxa" w:w="80"/>
+            </w:tcMar>
+            <w:vAlign w:val="top"/>
+          </w:tcPr>
+          <w:p/>
+        </w:tc>
+      </w:tr>
+      <w:tr>
+        <w:tblPrEx>
+          <w:shd w:val="clear" w:color="auto" w:fill="ced7e7"/>
+        </w:tblPrEx>
+        <w:trPr>
+          <w:trHeight w:val="580" w:hRule="atLeast"/>
+        </w:trPr>
+        <w:tc>
+          <w:tcPr>
+            <w:tcW w:type="dxa" w:w="2634"/>
+            <w:tcBorders>
+              <w:top w:val="single" w:color="ffffff" w:sz="4" w:space="0" w:shadow="0" w:frame="0"/>
               <w:left w:val="single" w:color="000000" w:sz="4" w:space="0" w:shadow="0" w:frame="0"/>
-              <w:bottom w:val="single" w:color="000000" w:sz="4" w:space="0" w:shadow="0" w:frame="0"/>
-              <w:right w:val="single" w:color="000000" w:sz="4" w:space="0" w:shadow="0" w:frame="0"/>
+              <w:bottom w:val="single" w:color="ffffff" w:sz="4" w:space="0" w:shadow="0" w:frame="0"/>
+              <w:right w:val="nil"/>
+            </w:tcBorders>
+            <w:shd w:val="clear" w:color="auto" w:fill="ffffff"/>
+            <w:tcMar>
+              <w:top w:type="dxa" w:w="80"/>
+              <w:left w:type="dxa" w:w="190"/>
+              <w:bottom w:type="dxa" w:w="80"/>
+              <w:right w:type="dxa" w:w="80"/>
+            </w:tcMar>
+            <w:vAlign w:val="top"/>
+          </w:tcPr>
+          <w:p>
+            <w:pPr>
+              <w:pStyle w:val="Textkörper"/>
+              <w:tabs>
+                <w:tab w:val="left" w:pos="1010"/>
+                <w:tab w:val="left" w:pos="1190"/>
+                <w:tab w:val="left" w:pos="1370"/>
+              </w:tabs>
+              <w:bidi w:val="0"/>
+              <w:spacing w:line="360" w:lineRule="auto"/>
+              <w:ind w:left="110" w:right="0" w:hanging="110"/>
+              <w:jc w:val="left"/>
+              <w:rPr>
+                <w:rtl w:val="0"/>
+              </w:rPr>
+            </w:pPr>
+            <w:r>
+              <w:rPr>
+                <w:b w:val="1"/>
+                <w:bCs w:val="1"/>
+                <w:sz w:val="20"/>
+                <w:szCs w:val="20"/>
+                <w:u w:val="single"/>
+                <w:shd w:val="nil" w:color="auto" w:fill="auto"/>
+                <w:rtl w:val="0"/>
+                <w:lang w:val="de-DE"/>
+              </w:rPr>
+              <w:t>Anschrift:</w:t>
+            </w:r>
+            <w:r>
+              <w:rPr>
+                <w:b w:val="1"/>
+                <w:bCs w:val="1"/>
+                <w:sz w:val="20"/>
+                <w:szCs w:val="20"/>
+                <w:shd w:val="nil" w:color="auto" w:fill="auto"/>
+                <w:rtl w:val="0"/>
+                <w:lang w:val="de-DE"/>
+              </w:rPr>
+              <w:t xml:space="preserve">    </w:t>
+              <w:tab/>
+              <w:tab/>
+              <w:t xml:space="preserve">          </w:t>
+            </w:r>
+            <w:r>
+              <w:rPr>
+                <w:b w:val="1"/>
+                <w:bCs w:val="1"/>
+                <w:sz w:val="20"/>
+                <w:szCs w:val="20"/>
+                <w:shd w:val="nil" w:color="auto" w:fill="auto"/>
+              </w:rPr>
+            </w:r>
+          </w:p>
+        </w:tc>
+        <w:tc>
+          <w:tcPr>
+            <w:tcW w:type="dxa" w:w="4662"/>
+            <w:tcBorders>
+              <w:top w:val="single" w:color="ffffff" w:sz="8" w:space="0" w:shadow="0" w:frame="0"/>
+              <w:left w:val="nil"/>
+              <w:bottom w:val="single" w:color="ffffff" w:sz="8" w:space="0" w:shadow="0" w:frame="0"/>
+              <w:right w:val="single" w:color="a7a7a7" w:sz="8" w:space="0" w:shadow="0" w:frame="0"/>
+            </w:tcBorders>
+            <w:shd w:val="clear" w:color="auto" w:fill="ffffff"/>
+            <w:tcMar>
+              <w:top w:type="dxa" w:w="80"/>
+              <w:left w:type="dxa" w:w="190"/>
+              <w:bottom w:type="dxa" w:w="80"/>
+              <w:right w:type="dxa" w:w="80"/>
+            </w:tcMar>
+            <w:vAlign w:val="top"/>
+          </w:tcPr>
+          <w:p>
+            <w:pPr>
+              <w:pStyle w:val="Textkörper"/>
+              <w:tabs>
+                <w:tab w:val="left" w:pos="1010"/>
+                <w:tab w:val="left" w:pos="1190"/>
+                <w:tab w:val="left" w:pos="1370"/>
+              </w:tabs>
+              <w:bidi w:val="0"/>
+              <w:spacing w:line="360" w:lineRule="auto"/>
+              <w:ind w:left="110" w:right="0" w:hanging="110"/>
+              <w:jc w:val="left"/>
+              <w:rPr>
+                <w:rtl w:val="0"/>
+              </w:rPr>
+            </w:pPr>
+            <w:r>
+              <w:rPr>
+                <w:b w:val="1"/>
+                <w:bCs w:val="1"/>
+                <w:sz w:val="20"/>
+                <w:szCs w:val="20"/>
+                <w:shd w:val="nil" w:color="auto" w:fill="auto"/>
+                <w:rtl w:val="0"/>
+                <w:lang w:val="en-US"/>
+              </w:rPr>
+              <w:t>$</w:t>
+            </w:r>
+            <w:r>
+              <w:rPr>
+                <w:b w:val="1"/>
+                <w:bCs w:val="1"/>
+                <w:sz w:val="20"/>
+                <w:szCs w:val="20"/>
+                <w:shd w:val="nil" w:color="auto" w:fill="auto"/>
+                <w:rtl w:val="0"/>
+                <w:lang w:val="en-US"/>
+              </w:rPr>
+              <w:t>{addresse}</w:t>
+            </w:r>
+            <w:r>
+              <w:rPr>
+                <w:b w:val="1"/>
+                <w:bCs w:val="1"/>
+                <w:sz w:val="20"/>
+                <w:szCs w:val="20"/>
+                <w:shd w:val="nil" w:color="auto" w:fill="auto"/>
+              </w:rPr>
+            </w:r>
+          </w:p>
+        </w:tc>
+        <w:tc>
+          <w:tcPr>
+            <w:tcW w:type="dxa" w:w="1510"/>
+            <w:tcBorders>
+              <w:top w:val="single" w:color="ffffff" w:sz="4" w:space="0" w:shadow="0" w:frame="0"/>
+              <w:left w:val="single" w:color="a7a7a7" w:sz="8" w:space="0" w:shadow="0" w:frame="0"/>
+              <w:bottom w:val="single" w:color="ffffff" w:sz="4" w:space="0" w:shadow="0" w:frame="0"/>
+              <w:right w:val="single" w:color="ffffff" w:sz="4" w:space="0" w:shadow="0" w:frame="0"/>
             </w:tcBorders>
             <w:shd w:val="clear" w:color="auto" w:fill="auto"/>
             <w:tcMar>
@@ -1868,7 +1350,10 @@
           <w:p>
             <w:pPr>
               <w:pStyle w:val="AB"/>
+              <w:bidi w:val="0"/>
               <w:spacing w:line="240" w:lineRule="auto"/>
+              <w:ind w:left="0" w:right="0" w:firstLine="0"/>
+              <w:jc w:val="left"/>
               <w:rPr>
                 <w:rFonts w:ascii="Arial" w:cs="Arial" w:hAnsi="Arial" w:eastAsia="Arial"/>
                 <w:b w:val="1"/>
@@ -1876,44 +1361,573 @@
                 <w:sz w:val="18"/>
                 <w:szCs w:val="18"/>
                 <w:shd w:val="nil" w:color="auto" w:fill="auto"/>
+                <w:rtl w:val="0"/>
+              </w:rPr>
+            </w:pPr>
+            <w:r>
+              <w:rPr>
+                <w:rFonts w:ascii="Arial" w:hAnsi="Arial"/>
+                <w:b w:val="1"/>
+                <w:bCs w:val="1"/>
+                <w:sz w:val="18"/>
+                <w:szCs w:val="18"/>
+                <w:shd w:val="nil" w:color="auto" w:fill="auto"/>
+                <w:rtl w:val="0"/>
                 <w:lang w:val="de-DE"/>
+              </w:rPr>
+              <w:t>Ton:</w:t>
+            </w:r>
+          </w:p>
+          <w:p>
+            <w:pPr>
+              <w:pStyle w:val="Standard"/>
+              <w:bidi w:val="0"/>
+              <w:ind w:left="0" w:right="0" w:firstLine="0"/>
+              <w:jc w:val="left"/>
+              <w:rPr>
+                <w:rtl w:val="0"/>
+              </w:rPr>
+            </w:pPr>
+            <w:r>
+              <w:rPr>
+                <w:rFonts w:ascii="Arial" w:hAnsi="Arial"/>
+                <w:b w:val="1"/>
+                <w:bCs w:val="1"/>
+                <w:sz w:val="18"/>
+                <w:szCs w:val="18"/>
+                <w:shd w:val="nil" w:color="auto" w:fill="auto"/>
+                <w:rtl w:val="0"/>
+                <w:lang w:val="de-DE"/>
+              </w:rPr>
+              <w:t>Kamera:</w:t>
+            </w:r>
+          </w:p>
+        </w:tc>
+        <w:tc>
+          <w:tcPr>
+            <w:tcW w:type="dxa" w:w="1095"/>
+            <w:tcBorders>
+              <w:top w:val="single" w:color="ffffff" w:sz="4" w:space="0" w:shadow="0" w:frame="0"/>
+              <w:left w:val="single" w:color="ffffff" w:sz="4" w:space="0" w:shadow="0" w:frame="0"/>
+              <w:bottom w:val="single" w:color="ffffff" w:sz="4" w:space="0" w:shadow="0" w:frame="0"/>
+              <w:right w:val="single" w:color="525252" w:sz="4" w:space="0" w:shadow="0" w:frame="0"/>
+            </w:tcBorders>
+            <w:shd w:val="clear" w:color="auto" w:fill="auto"/>
+            <w:tcMar>
+              <w:top w:type="dxa" w:w="80"/>
+              <w:left w:type="dxa" w:w="80"/>
+              <w:bottom w:type="dxa" w:w="80"/>
+              <w:right w:type="dxa" w:w="80"/>
+            </w:tcMar>
+            <w:vAlign w:val="top"/>
+          </w:tcPr>
+          <w:p/>
+        </w:tc>
+      </w:tr>
+      <w:tr>
+        <w:tblPrEx>
+          <w:shd w:val="clear" w:color="auto" w:fill="ced7e7"/>
+        </w:tblPrEx>
+        <w:trPr>
+          <w:trHeight w:val="2034" w:hRule="atLeast"/>
+        </w:trPr>
+        <w:tc>
+          <w:tcPr>
+            <w:tcW w:type="dxa" w:w="2634"/>
+            <w:tcBorders>
+              <w:top w:val="single" w:color="ffffff" w:sz="4" w:space="0" w:shadow="0" w:frame="0"/>
+              <w:left w:val="single" w:color="000000" w:sz="4" w:space="0" w:shadow="0" w:frame="0"/>
+              <w:bottom w:val="single" w:color="525252" w:sz="4" w:space="0" w:shadow="0" w:frame="0"/>
+              <w:right w:val="single" w:color="ffffff" w:sz="8" w:space="0" w:shadow="0" w:frame="0"/>
+            </w:tcBorders>
+            <w:shd w:val="clear" w:color="auto" w:fill="ffffff"/>
+            <w:tcMar>
+              <w:top w:type="dxa" w:w="80"/>
+              <w:left w:type="dxa" w:w="190"/>
+              <w:bottom w:type="dxa" w:w="80"/>
+              <w:right w:type="dxa" w:w="80"/>
+            </w:tcMar>
+            <w:vAlign w:val="top"/>
+          </w:tcPr>
+          <w:p>
+            <w:pPr>
+              <w:pStyle w:val="Textkörper"/>
+              <w:tabs>
+                <w:tab w:val="left" w:pos="1010"/>
+                <w:tab w:val="left" w:pos="1190"/>
+                <w:tab w:val="left" w:pos="1370"/>
+              </w:tabs>
+              <w:bidi w:val="0"/>
+              <w:spacing w:line="360" w:lineRule="auto"/>
+              <w:ind w:left="110" w:right="0" w:hanging="110"/>
+              <w:jc w:val="left"/>
+              <w:rPr>
+                <w:rtl w:val="0"/>
+              </w:rPr>
+            </w:pPr>
+            <w:r>
+              <w:rPr>
+                <w:b w:val="1"/>
+                <w:bCs w:val="1"/>
+                <w:sz w:val="20"/>
+                <w:szCs w:val="20"/>
+                <w:u w:val="single"/>
+                <w:shd w:val="nil" w:color="auto" w:fill="auto"/>
+                <w:rtl w:val="0"/>
+                <w:lang w:val="de-DE"/>
+              </w:rPr>
+              <w:t>Ansprechpartnerin:</w:t>
+            </w:r>
+            <w:r>
+              <w:rPr>
+                <w:b w:val="1"/>
+                <w:bCs w:val="1"/>
+                <w:sz w:val="20"/>
+                <w:szCs w:val="20"/>
+                <w:shd w:val="nil" w:color="auto" w:fill="auto"/>
+                <w:rtl w:val="0"/>
+                <w:lang w:val="de-DE"/>
+              </w:rPr>
+              <w:t xml:space="preserve">   </w:t>
+            </w:r>
+          </w:p>
+        </w:tc>
+        <w:tc>
+          <w:tcPr>
+            <w:tcW w:type="dxa" w:w="4662"/>
+            <w:tcBorders>
+              <w:top w:val="single" w:color="ffffff" w:sz="8" w:space="0" w:shadow="0" w:frame="0"/>
+              <w:left w:val="single" w:color="ffffff" w:sz="8" w:space="0" w:shadow="0" w:frame="0"/>
+              <w:bottom w:val="single" w:color="a7a7a7" w:sz="8" w:space="0" w:shadow="0" w:frame="0"/>
+              <w:right w:val="single" w:color="a7a7a7" w:sz="8" w:space="0" w:shadow="0" w:frame="0"/>
+            </w:tcBorders>
+            <w:shd w:val="clear" w:color="auto" w:fill="ffffff"/>
+            <w:tcMar>
+              <w:top w:type="dxa" w:w="80"/>
+              <w:left w:type="dxa" w:w="190"/>
+              <w:bottom w:type="dxa" w:w="80"/>
+              <w:right w:type="dxa" w:w="80"/>
+            </w:tcMar>
+            <w:vAlign w:val="top"/>
+          </w:tcPr>
+          <w:p>
+            <w:pPr>
+              <w:pStyle w:val="Textkörper"/>
+              <w:tabs>
+                <w:tab w:val="left" w:pos="1010"/>
+                <w:tab w:val="left" w:pos="1190"/>
+                <w:tab w:val="left" w:pos="1370"/>
+              </w:tabs>
+              <w:bidi w:val="0"/>
+              <w:spacing w:line="360" w:lineRule="auto"/>
+              <w:ind w:left="110" w:right="0" w:hanging="110"/>
+              <w:jc w:val="left"/>
+              <w:rPr>
+                <w:b w:val="1"/>
+                <w:bCs w:val="1"/>
+                <w:sz w:val="20"/>
+                <w:szCs w:val="20"/>
+                <w:shd w:val="nil" w:color="auto" w:fill="auto"/>
+                <w:rtl w:val="0"/>
+              </w:rPr>
+            </w:pPr>
+            <w:r>
+              <w:rPr>
+                <w:b w:val="1"/>
+                <w:bCs w:val="1"/>
+                <w:sz w:val="20"/>
+                <w:szCs w:val="20"/>
+                <w:shd w:val="nil" w:color="auto" w:fill="auto"/>
+                <w:rtl w:val="0"/>
+                <w:lang w:val="en-US"/>
+              </w:rPr>
+              <w:t>$</w:t>
+            </w:r>
+            <w:r>
+              <w:rPr>
+                <w:b w:val="1"/>
+                <w:bCs w:val="1"/>
+                <w:sz w:val="20"/>
+                <w:szCs w:val="20"/>
+                <w:shd w:val="nil" w:color="auto" w:fill="auto"/>
+                <w:rtl w:val="0"/>
+                <w:lang w:val="en-US"/>
+              </w:rPr>
+              <w:t>{</w:t>
+            </w:r>
+            <w:r>
+              <w:rPr>
+                <w:b w:val="1"/>
+                <w:bCs w:val="1"/>
+                <w:sz w:val="20"/>
+                <w:szCs w:val="20"/>
+                <w:shd w:val="nil" w:color="auto" w:fill="auto"/>
+                <w:rtl w:val="0"/>
+                <w:lang w:val="de-DE"/>
+              </w:rPr>
+              <w:t>Ansprechpartnerin</w:t>
+            </w:r>
+            <w:r>
+              <w:rPr>
+                <w:b w:val="1"/>
+                <w:bCs w:val="1"/>
+                <w:sz w:val="20"/>
+                <w:szCs w:val="20"/>
+                <w:shd w:val="nil" w:color="auto" w:fill="auto"/>
+                <w:rtl w:val="0"/>
+                <w:lang w:val="en-US"/>
+              </w:rPr>
+              <w:t>}</w:t>
+            </w:r>
+          </w:p>
+          <w:p>
+            <w:pPr>
+              <w:pStyle w:val="Textkörper"/>
+              <w:tabs>
+                <w:tab w:val="left" w:pos="1010"/>
+                <w:tab w:val="left" w:pos="1190"/>
+                <w:tab w:val="left" w:pos="1370"/>
+              </w:tabs>
+              <w:bidi w:val="0"/>
+              <w:spacing w:line="360" w:lineRule="auto"/>
+              <w:ind w:left="110" w:right="0" w:hanging="110"/>
+              <w:jc w:val="left"/>
+              <w:rPr>
+                <w:b w:val="1"/>
+                <w:bCs w:val="1"/>
+                <w:sz w:val="20"/>
+                <w:szCs w:val="20"/>
+                <w:shd w:val="nil" w:color="auto" w:fill="auto"/>
+                <w:rtl w:val="0"/>
+              </w:rPr>
+            </w:pPr>
+            <w:r>
+              <w:rPr>
+                <w:b w:val="0"/>
+                <w:bCs w:val="0"/>
+                <w:sz w:val="20"/>
+                <w:szCs w:val="20"/>
+                <w:shd w:val="nil" w:color="auto" w:fill="auto"/>
+                <w:rtl w:val="0"/>
+                <w:lang w:val="de-DE"/>
+              </w:rPr>
+              <w:t>Tel.:</w:t>
+            </w:r>
+            <w:r>
+              <w:rPr>
+                <w:b w:val="0"/>
+                <w:bCs w:val="0"/>
+                <w:sz w:val="20"/>
+                <w:szCs w:val="20"/>
+                <w:shd w:val="nil" w:color="auto" w:fill="auto"/>
+                <w:rtl w:val="0"/>
+                <w:lang w:val="en-US"/>
+              </w:rPr>
+              <w:t xml:space="preserve"> </w:t>
+            </w:r>
+            <w:r>
+              <w:rPr>
+                <w:b w:val="0"/>
+                <w:bCs w:val="0"/>
+                <w:sz w:val="20"/>
+                <w:szCs w:val="20"/>
+                <w:shd w:val="nil" w:color="auto" w:fill="auto"/>
+                <w:rtl w:val="0"/>
+                <w:lang w:val="en-US"/>
+              </w:rPr>
+              <w:t>$</w:t>
+            </w:r>
+            <w:r>
+              <w:rPr>
+                <w:b w:val="1"/>
+                <w:bCs w:val="1"/>
+                <w:sz w:val="20"/>
+                <w:szCs w:val="20"/>
+                <w:shd w:val="nil" w:color="auto" w:fill="auto"/>
+                <w:rtl w:val="0"/>
+                <w:lang w:val="en-US"/>
+              </w:rPr>
+              <w:t>{</w:t>
+            </w:r>
+            <w:r>
+              <w:rPr>
+                <w:b w:val="1"/>
+                <w:bCs w:val="1"/>
+                <w:sz w:val="20"/>
+                <w:szCs w:val="20"/>
+                <w:shd w:val="nil" w:color="auto" w:fill="auto"/>
+                <w:rtl w:val="0"/>
+                <w:lang w:val="de-DE"/>
+              </w:rPr>
+              <w:t>Ansprechpartnerin</w:t>
+            </w:r>
+            <w:r>
+              <w:rPr>
+                <w:b w:val="1"/>
+                <w:bCs w:val="1"/>
+                <w:sz w:val="20"/>
+                <w:szCs w:val="20"/>
+                <w:shd w:val="nil" w:color="auto" w:fill="auto"/>
+                <w:rtl w:val="0"/>
+                <w:lang w:val="en-US"/>
+              </w:rPr>
+              <w:t>_tel}</w:t>
+            </w:r>
+          </w:p>
+          <w:p>
+            <w:pPr>
+              <w:pStyle w:val="Textkörper"/>
+              <w:tabs>
+                <w:tab w:val="left" w:pos="1010"/>
+                <w:tab w:val="left" w:pos="1190"/>
+                <w:tab w:val="left" w:pos="1370"/>
+              </w:tabs>
+              <w:bidi w:val="0"/>
+              <w:spacing w:line="360" w:lineRule="auto"/>
+              <w:ind w:left="110" w:right="0" w:hanging="110"/>
+              <w:jc w:val="left"/>
+              <w:rPr>
+                <w:rtl w:val="0"/>
+              </w:rPr>
+            </w:pPr>
+            <w:r>
+              <w:rPr>
+                <w:sz w:val="20"/>
+                <w:szCs w:val="20"/>
+                <w:shd w:val="nil" w:color="auto" w:fill="auto"/>
+                <w:rtl w:val="0"/>
+                <w:lang w:val="en-US"/>
+              </w:rPr>
+              <w:t xml:space="preserve">Mail: </w:t>
+            </w:r>
+            <w:r>
+              <w:rPr>
+                <w:sz w:val="20"/>
+                <w:szCs w:val="20"/>
+                <w:shd w:val="nil" w:color="auto" w:fill="auto"/>
+                <w:rtl w:val="0"/>
+                <w:lang w:val="en-US"/>
+              </w:rPr>
+              <w:t>$</w:t>
+            </w:r>
+            <w:r>
+              <w:rPr>
+                <w:b w:val="1"/>
+                <w:bCs w:val="1"/>
+                <w:sz w:val="20"/>
+                <w:szCs w:val="20"/>
+                <w:shd w:val="nil" w:color="auto" w:fill="auto"/>
+                <w:rtl w:val="0"/>
+                <w:lang w:val="en-US"/>
+              </w:rPr>
+              <w:t>{</w:t>
+            </w:r>
+            <w:r>
+              <w:rPr>
+                <w:b w:val="1"/>
+                <w:bCs w:val="1"/>
+                <w:sz w:val="20"/>
+                <w:szCs w:val="20"/>
+                <w:shd w:val="nil" w:color="auto" w:fill="auto"/>
+                <w:rtl w:val="0"/>
+                <w:lang w:val="de-DE"/>
+              </w:rPr>
+              <w:t>Ansprechpartnerin</w:t>
+            </w:r>
+            <w:r>
+              <w:rPr>
+                <w:b w:val="1"/>
+                <w:bCs w:val="1"/>
+                <w:sz w:val="20"/>
+                <w:szCs w:val="20"/>
+                <w:shd w:val="nil" w:color="auto" w:fill="auto"/>
+                <w:rtl w:val="0"/>
+                <w:lang w:val="en-US"/>
+              </w:rPr>
+              <w:t>_mail}</w:t>
+            </w:r>
+          </w:p>
+        </w:tc>
+        <w:tc>
+          <w:tcPr>
+            <w:tcW w:type="dxa" w:w="1510"/>
+            <w:tcBorders>
+              <w:top w:val="single" w:color="ffffff" w:sz="4" w:space="0" w:shadow="0" w:frame="0"/>
+              <w:left w:val="single" w:color="a7a7a7" w:sz="8" w:space="0" w:shadow="0" w:frame="0"/>
+              <w:bottom w:val="single" w:color="525252" w:sz="4" w:space="0" w:shadow="0" w:frame="0"/>
+              <w:right w:val="single" w:color="ffffff" w:sz="4" w:space="0" w:shadow="0" w:frame="0"/>
+            </w:tcBorders>
+            <w:shd w:val="clear" w:color="auto" w:fill="auto"/>
+            <w:tcMar>
+              <w:top w:type="dxa" w:w="80"/>
+              <w:left w:type="dxa" w:w="80"/>
+              <w:bottom w:type="dxa" w:w="80"/>
+              <w:right w:type="dxa" w:w="80"/>
+            </w:tcMar>
+            <w:vAlign w:val="top"/>
+          </w:tcPr>
+          <w:p>
+            <w:pPr>
+              <w:pStyle w:val="Standard"/>
+              <w:bidi w:val="0"/>
+              <w:ind w:left="0" w:right="0" w:firstLine="0"/>
+              <w:jc w:val="left"/>
+              <w:rPr>
+                <w:rFonts w:ascii="Arial" w:cs="Arial" w:hAnsi="Arial" w:eastAsia="Arial"/>
+                <w:b w:val="1"/>
+                <w:bCs w:val="1"/>
+                <w:i w:val="1"/>
+                <w:iCs w:val="1"/>
+                <w:sz w:val="18"/>
+                <w:szCs w:val="18"/>
+                <w:shd w:val="nil" w:color="auto" w:fill="auto"/>
+                <w:rtl w:val="0"/>
+              </w:rPr>
+            </w:pPr>
+            <w:r>
+              <w:rPr>
+                <w:rFonts w:ascii="Arial" w:hAnsi="Arial"/>
+                <w:b w:val="1"/>
+                <w:bCs w:val="1"/>
+                <w:i w:val="1"/>
+                <w:iCs w:val="1"/>
+                <w:sz w:val="18"/>
+                <w:szCs w:val="18"/>
+                <w:shd w:val="nil" w:color="auto" w:fill="auto"/>
+                <w:rtl w:val="0"/>
+                <w:lang w:val="de-DE"/>
+              </w:rPr>
+              <w:t>Treff Motiv</w:t>
+            </w:r>
+          </w:p>
+          <w:p>
+            <w:pPr>
+              <w:pStyle w:val="Standard"/>
+              <w:bidi w:val="0"/>
+              <w:ind w:left="0" w:right="0" w:firstLine="0"/>
+              <w:jc w:val="left"/>
+              <w:rPr>
+                <w:rFonts w:ascii="Arial" w:cs="Arial" w:hAnsi="Arial" w:eastAsia="Arial"/>
+                <w:b w:val="1"/>
+                <w:bCs w:val="1"/>
+                <w:sz w:val="18"/>
+                <w:szCs w:val="18"/>
+                <w:shd w:val="nil" w:color="auto" w:fill="auto"/>
+                <w:rtl w:val="0"/>
+                <w:lang w:val="de-DE"/>
+              </w:rPr>
+            </w:pPr>
+            <w:r>
+              <w:rPr>
+                <w:rFonts w:ascii="Arial" w:hAnsi="Arial"/>
+                <w:b w:val="1"/>
+                <w:bCs w:val="1"/>
+                <w:sz w:val="18"/>
+                <w:szCs w:val="18"/>
+                <w:shd w:val="nil" w:color="auto" w:fill="auto"/>
+                <w:rtl w:val="0"/>
+                <w:lang w:val="de-DE"/>
+              </w:rPr>
+              <w:t>Protagonistin:</w:t>
+            </w:r>
+          </w:p>
+          <w:p>
+            <w:pPr>
+              <w:pStyle w:val="Standard"/>
+              <w:bidi w:val="0"/>
+              <w:ind w:left="0" w:right="0" w:firstLine="0"/>
+              <w:jc w:val="left"/>
+              <w:rPr>
+                <w:rFonts w:ascii="Arial" w:cs="Arial" w:hAnsi="Arial" w:eastAsia="Arial"/>
+                <w:b w:val="1"/>
+                <w:bCs w:val="1"/>
+                <w:sz w:val="18"/>
+                <w:szCs w:val="18"/>
+                <w:rtl w:val="0"/>
               </w:rPr>
             </w:pPr>
           </w:p>
           <w:p>
             <w:pPr>
-              <w:pStyle w:val="AB"/>
-              <w:spacing w:line="240" w:lineRule="auto"/>
+              <w:pStyle w:val="Standard"/>
+              <w:bidi w:val="0"/>
+              <w:ind w:left="0" w:right="0" w:firstLine="0"/>
+              <w:jc w:val="left"/>
               <w:rPr>
                 <w:rFonts w:ascii="Arial" w:cs="Arial" w:hAnsi="Arial" w:eastAsia="Arial"/>
                 <w:b w:val="1"/>
                 <w:bCs w:val="1"/>
-                <w:outline w:val="0"/>
-                <w:color w:val="ff0000"/>
                 <w:sz w:val="18"/>
                 <w:szCs w:val="18"/>
-                <w:u w:color="ff0000"/>
-                <w:shd w:val="nil" w:color="auto" w:fill="auto"/>
+                <w:shd w:val="nil" w:color="auto" w:fill="auto"/>
+                <w:rtl w:val="0"/>
+              </w:rPr>
+            </w:pPr>
+            <w:r>
+              <w:rPr>
+                <w:rFonts w:ascii="Arial" w:hAnsi="Arial"/>
+                <w:b w:val="1"/>
+                <w:bCs w:val="1"/>
+                <w:sz w:val="18"/>
+                <w:szCs w:val="18"/>
+                <w:shd w:val="nil" w:color="auto" w:fill="auto"/>
+                <w:rtl w:val="0"/>
                 <w:lang w:val="de-DE"/>
-                <w14:textFill>
-                  <w14:solidFill>
-                    <w14:srgbClr w14:val="FF0000"/>
-                  </w14:solidFill>
-                </w14:textFill>
+              </w:rPr>
+              <w:t>Drehbeginn:</w:t>
+            </w:r>
+          </w:p>
+          <w:p>
+            <w:pPr>
+              <w:pStyle w:val="Standard"/>
+              <w:rPr>
+                <w:rFonts w:ascii="Arial" w:cs="Arial" w:hAnsi="Arial" w:eastAsia="Arial"/>
+                <w:b w:val="1"/>
+                <w:bCs w:val="1"/>
+                <w:sz w:val="18"/>
+                <w:szCs w:val="18"/>
+                <w:shd w:val="nil" w:color="auto" w:fill="auto"/>
+                <w:lang w:val="de-DE"/>
               </w:rPr>
             </w:pPr>
           </w:p>
           <w:p>
             <w:pPr>
-              <w:pStyle w:val="AB"/>
-              <w:spacing w:line="240" w:lineRule="auto"/>
+              <w:pStyle w:val="Standard"/>
+              <w:bidi w:val="0"/>
+              <w:ind w:left="0" w:right="0" w:firstLine="0"/>
+              <w:jc w:val="left"/>
               <w:rPr>
                 <w:rFonts w:ascii="Arial" w:cs="Arial" w:hAnsi="Arial" w:eastAsia="Arial"/>
                 <w:b w:val="1"/>
                 <w:bCs w:val="1"/>
                 <w:sz w:val="18"/>
                 <w:szCs w:val="18"/>
-                <w:u w:color="ff0000"/>
+                <w:shd w:val="nil" w:color="auto" w:fill="auto"/>
+                <w:rtl w:val="0"/>
+              </w:rPr>
+            </w:pPr>
+            <w:r>
+              <w:rPr>
+                <w:rFonts w:ascii="Arial" w:hAnsi="Arial"/>
+                <w:b w:val="1"/>
+                <w:bCs w:val="1"/>
+                <w:sz w:val="18"/>
+                <w:szCs w:val="18"/>
+                <w:shd w:val="nil" w:color="auto" w:fill="auto"/>
+                <w:rtl w:val="0"/>
+                <w:lang w:val="de-DE"/>
+              </w:rPr>
+              <w:t>Drehschluss ca. :</w:t>
+            </w:r>
+          </w:p>
+          <w:p>
+            <w:pPr>
+              <w:pStyle w:val="Standard"/>
+              <w:rPr>
+                <w:rFonts w:ascii="Arial" w:cs="Arial" w:hAnsi="Arial" w:eastAsia="Arial"/>
+                <w:b w:val="1"/>
+                <w:bCs w:val="1"/>
                 <w:shd w:val="nil" w:color="auto" w:fill="auto"/>
                 <w:lang w:val="de-DE"/>
               </w:rPr>
@@ -1921,8 +1935,54 @@
           </w:p>
           <w:p>
             <w:pPr>
+              <w:pStyle w:val="Standard"/>
+              <w:bidi w:val="0"/>
+              <w:ind w:left="0" w:right="0" w:firstLine="0"/>
+              <w:jc w:val="left"/>
+              <w:rPr>
+                <w:rtl w:val="0"/>
+              </w:rPr>
+            </w:pPr>
+            <w:r>
+              <w:rPr>
+                <w:rFonts w:ascii="Arial" w:hAnsi="Arial"/>
+                <w:b w:val="1"/>
+                <w:bCs w:val="1"/>
+                <w:sz w:val="18"/>
+                <w:szCs w:val="18"/>
+                <w:shd w:val="nil" w:color="auto" w:fill="auto"/>
+                <w:rtl w:val="0"/>
+                <w:lang w:val="de-DE"/>
+              </w:rPr>
+              <w:t>Arbeitsende ca.:</w:t>
+            </w:r>
+          </w:p>
+        </w:tc>
+        <w:tc>
+          <w:tcPr>
+            <w:tcW w:type="dxa" w:w="1095"/>
+            <w:tcBorders>
+              <w:top w:val="single" w:color="ffffff" w:sz="4" w:space="0" w:shadow="0" w:frame="0"/>
+              <w:left w:val="single" w:color="ffffff" w:sz="4" w:space="0" w:shadow="0" w:frame="0"/>
+              <w:bottom w:val="single" w:color="525252" w:sz="4" w:space="0" w:shadow="0" w:frame="0"/>
+              <w:right w:val="single" w:color="525252" w:sz="4" w:space="0" w:shadow="0" w:frame="0"/>
+            </w:tcBorders>
+            <w:shd w:val="clear" w:color="auto" w:fill="auto"/>
+            <w:tcMar>
+              <w:top w:type="dxa" w:w="80"/>
+              <w:left w:type="dxa" w:w="80"/>
+              <w:bottom w:type="dxa" w:w="80"/>
+              <w:right w:type="dxa" w:w="80"/>
+            </w:tcMar>
+            <w:vAlign w:val="top"/>
+          </w:tcPr>
+          <w:p>
+            <w:pPr>
               <w:pStyle w:val="AB"/>
+              <w:bidi w:val="0"/>
               <w:spacing w:line="240" w:lineRule="auto"/>
+              <w:ind w:left="0" w:right="0" w:firstLine="0"/>
+              <w:jc w:val="left"/>
               <w:rPr>
                 <w:rFonts w:ascii="Arial" w:cs="Arial" w:hAnsi="Arial" w:eastAsia="Arial"/>
                 <w:b w:val="1"/>
@@ -1930,88 +1990,7 @@
                 <w:sz w:val="18"/>
                 <w:szCs w:val="18"/>
                 <w:u w:color="ff0000"/>
-                <w:shd w:val="nil" w:color="auto" w:fill="auto"/>
-                <w:lang w:val="de-DE"/>
-              </w:rPr>
-            </w:pPr>
-          </w:p>
-          <w:p>
-            <w:pPr>
-              <w:pStyle w:val="AB"/>
-              <w:spacing w:line="240" w:lineRule="auto"/>
-              <w:rPr>
-                <w:rFonts w:ascii="Arial" w:cs="Arial" w:hAnsi="Arial" w:eastAsia="Arial"/>
-                <w:b w:val="1"/>
-                <w:bCs w:val="1"/>
-                <w:sz w:val="18"/>
-                <w:szCs w:val="18"/>
-                <w:u w:color="ff0000"/>
-                <w:shd w:val="nil" w:color="auto" w:fill="auto"/>
-                <w:lang w:val="de-DE"/>
-              </w:rPr>
-            </w:pPr>
-          </w:p>
-          <w:p>
-            <w:pPr>
-              <w:pStyle w:val="AB"/>
-              <w:spacing w:line="240" w:lineRule="auto"/>
-              <w:rPr>
-                <w:rFonts w:ascii="Arial" w:cs="Arial" w:hAnsi="Arial" w:eastAsia="Arial"/>
-                <w:b w:val="1"/>
-                <w:bCs w:val="1"/>
-                <w:sz w:val="18"/>
-                <w:szCs w:val="18"/>
-                <w:u w:color="ff0000"/>
-                <w:shd w:val="nil" w:color="auto" w:fill="auto"/>
-                <w:lang w:val="de-DE"/>
-              </w:rPr>
-            </w:pPr>
-          </w:p>
-          <w:p>
-            <w:pPr>
-              <w:pStyle w:val="AB"/>
-              <w:spacing w:line="240" w:lineRule="auto"/>
-              <w:rPr>
-                <w:rFonts w:ascii="Arial" w:cs="Arial" w:hAnsi="Arial" w:eastAsia="Arial"/>
-                <w:b w:val="1"/>
-                <w:bCs w:val="1"/>
-                <w:sz w:val="18"/>
-                <w:szCs w:val="18"/>
-                <w:u w:color="ff0000"/>
-                <w:shd w:val="nil" w:color="auto" w:fill="auto"/>
-                <w:lang w:val="de-DE"/>
-              </w:rPr>
-            </w:pPr>
-          </w:p>
-          <w:p>
-            <w:pPr>
-              <w:pStyle w:val="AB"/>
-              <w:spacing w:line="240" w:lineRule="auto"/>
-              <w:rPr>
-                <w:rFonts w:ascii="Arial" w:cs="Arial" w:hAnsi="Arial" w:eastAsia="Arial"/>
-                <w:b w:val="1"/>
-                <w:bCs w:val="1"/>
-                <w:sz w:val="18"/>
-                <w:szCs w:val="18"/>
-                <w:u w:color="ff0000"/>
-                <w:shd w:val="nil" w:color="auto" w:fill="auto"/>
-                <w:lang w:val="de-DE"/>
-              </w:rPr>
-            </w:pPr>
-          </w:p>
-          <w:p>
-            <w:pPr>
-              <w:pStyle w:val="AB"/>
-              <w:spacing w:line="240" w:lineRule="auto"/>
-              <w:rPr>
-                <w:rFonts w:ascii="Arial" w:cs="Arial" w:hAnsi="Arial" w:eastAsia="Arial"/>
-                <w:b w:val="1"/>
-                <w:bCs w:val="1"/>
-                <w:sz w:val="18"/>
-                <w:szCs w:val="18"/>
-                <w:u w:color="ff0000"/>
-                <w:shd w:val="nil" w:color="auto" w:fill="auto"/>
-                <w:lang w:val="de-DE"/>
+                <w:rtl w:val="0"/>
               </w:rPr>
             </w:pPr>
           </w:p>
@@ -2029,80 +2008,7 @@
                 <w:sz w:val="18"/>
                 <w:szCs w:val="18"/>
                 <w:u w:color="ff0000"/>
-                <w:shd w:val="nil" w:color="auto" w:fill="auto"/>
-                <w:rtl w:val="0"/>
-              </w:rPr>
-            </w:pPr>
-            <w:r>
-              <w:rPr>
-                <w:rFonts w:ascii="Arial" w:hAnsi="Arial"/>
-                <w:b w:val="1"/>
-                <w:bCs w:val="1"/>
-                <w:sz w:val="18"/>
-                <w:szCs w:val="18"/>
-                <w:u w:color="ff0000"/>
-                <w:shd w:val="nil" w:color="auto" w:fill="auto"/>
-                <w:rtl w:val="0"/>
-                <w:lang w:val="en-US"/>
-              </w:rPr>
-              <w:t>$</w:t>
-            </w:r>
-            <w:r>
-              <w:rPr>
-                <w:rFonts w:ascii="Arial" w:hAnsi="Arial"/>
-                <w:b w:val="1"/>
-                <w:bCs w:val="1"/>
-                <w:sz w:val="18"/>
-                <w:szCs w:val="18"/>
-                <w:u w:color="ff0000"/>
-                <w:shd w:val="nil" w:color="auto" w:fill="auto"/>
-                <w:rtl w:val="0"/>
-                <w:lang w:val="en-US"/>
-              </w:rPr>
-              <w:t>{</w:t>
-            </w:r>
-            <w:r>
-              <w:rPr>
-                <w:rFonts w:ascii="Arial" w:hAnsi="Arial"/>
-                <w:b w:val="1"/>
-                <w:bCs w:val="1"/>
-                <w:sz w:val="18"/>
-                <w:szCs w:val="18"/>
-                <w:u w:color="ff0000"/>
-                <w:shd w:val="nil" w:color="auto" w:fill="auto"/>
-                <w:rtl w:val="0"/>
-                <w:lang w:val="de-DE"/>
-              </w:rPr>
-              <w:t>uhrzeit_beginn</w:t>
-            </w:r>
-            <w:r>
-              <w:rPr>
-                <w:rFonts w:ascii="Arial" w:hAnsi="Arial"/>
-                <w:b w:val="1"/>
-                <w:bCs w:val="1"/>
-                <w:sz w:val="18"/>
-                <w:szCs w:val="18"/>
-                <w:u w:color="ff0000"/>
-                <w:shd w:val="nil" w:color="auto" w:fill="auto"/>
-                <w:rtl w:val="0"/>
-                <w:lang w:val="en-US"/>
-              </w:rPr>
-              <w:t>}</w:t>
-            </w:r>
-          </w:p>
-          <w:p>
-            <w:pPr>
-              <w:pStyle w:val="AB"/>
-              <w:spacing w:line="240" w:lineRule="auto"/>
-              <w:rPr>
-                <w:rFonts w:ascii="Arial" w:cs="Arial" w:hAnsi="Arial" w:eastAsia="Arial"/>
-                <w:b w:val="1"/>
-                <w:bCs w:val="1"/>
-                <w:sz w:val="18"/>
-                <w:szCs w:val="18"/>
-                <w:u w:color="ff0000"/>
-                <w:shd w:val="nil" w:color="auto" w:fill="auto"/>
-                <w:lang w:val="de-DE"/>
+                <w:rtl w:val="0"/>
               </w:rPr>
             </w:pPr>
           </w:p>
@@ -2120,13 +2026,19 @@
                 <w:sz w:val="18"/>
                 <w:szCs w:val="18"/>
                 <w:u w:color="ff0000"/>
-                <w:shd w:val="nil" w:color="auto" w:fill="auto"/>
                 <w:rtl w:val="0"/>
               </w:rPr>
             </w:pPr>
-            <w:r>
-              <w:rPr>
-                <w:rFonts w:ascii="Arial" w:hAnsi="Arial"/>
+          </w:p>
+          <w:p>
+            <w:pPr>
+              <w:pStyle w:val="AB"/>
+              <w:bidi w:val="0"/>
+              <w:spacing w:line="240" w:lineRule="auto"/>
+              <w:ind w:left="0" w:right="0" w:firstLine="0"/>
+              <w:jc w:val="left"/>
+              <w:rPr>
+                <w:rFonts w:ascii="Arial" w:cs="Arial" w:hAnsi="Arial" w:eastAsia="Arial"/>
                 <w:b w:val="1"/>
                 <w:bCs w:val="1"/>
                 <w:sz w:val="18"/>
@@ -2134,10 +2046,8 @@
                 <w:u w:color="ff0000"/>
                 <w:shd w:val="nil" w:color="auto" w:fill="auto"/>
                 <w:rtl w:val="0"/>
-                <w:lang w:val="en-US"/>
-              </w:rPr>
-              <w:t>$</w:t>
-            </w:r>
+              </w:rPr>
+            </w:pPr>
             <w:r>
               <w:rPr>
                 <w:rFonts w:ascii="Arial" w:hAnsi="Arial"/>
@@ -2150,7 +2060,7 @@
                 <w:rtl w:val="0"/>
                 <w:lang w:val="en-US"/>
               </w:rPr>
-              <w:t>{</w:t>
+              <w:t>$</w:t>
             </w:r>
             <w:r>
               <w:rPr>
@@ -2162,23 +2072,9 @@
                 <w:u w:color="ff0000"/>
                 <w:shd w:val="nil" w:color="auto" w:fill="auto"/>
                 <w:rtl w:val="0"/>
-                <w:lang w:val="de-DE"/>
-              </w:rPr>
-              <w:t>uhrzeit_ende</w:t>
-            </w:r>
-            <w:r>
-              <w:rPr>
-                <w:rFonts w:ascii="Arial" w:hAnsi="Arial"/>
-                <w:b w:val="1"/>
-                <w:bCs w:val="1"/>
-                <w:sz w:val="18"/>
-                <w:szCs w:val="18"/>
-                <w:u w:color="ff0000"/>
-                <w:shd w:val="nil" w:color="auto" w:fill="auto"/>
-                <w:rtl w:val="0"/>
                 <w:lang w:val="en-US"/>
               </w:rPr>
-              <w:t>}</w:t>
+              <w:t>{start}</w:t>
             </w:r>
           </w:p>
           <w:p>
@@ -2200,26 +2096,41 @@
           <w:p>
             <w:pPr>
               <w:pStyle w:val="AB"/>
+              <w:bidi w:val="0"/>
               <w:spacing w:line="240" w:lineRule="auto"/>
+              <w:ind w:left="0" w:right="0" w:firstLine="0"/>
+              <w:jc w:val="left"/>
+              <w:rPr>
+                <w:rtl w:val="0"/>
+              </w:rPr>
             </w:pPr>
             <w:r>
               <w:rPr>
-                <w:rFonts w:ascii="Arial" w:cs="Arial" w:hAnsi="Arial" w:eastAsia="Arial"/>
-                <w:b w:val="1"/>
-                <w:bCs w:val="1"/>
-                <w:outline w:val="0"/>
-                <w:color w:val="ff0000"/>
+                <w:rFonts w:ascii="Arial" w:hAnsi="Arial"/>
+                <w:b w:val="1"/>
+                <w:bCs w:val="1"/>
                 <w:sz w:val="18"/>
                 <w:szCs w:val="18"/>
                 <w:u w:color="ff0000"/>
                 <w:shd w:val="nil" w:color="auto" w:fill="auto"/>
-                <w:lang w:val="de-DE"/>
-                <w14:textFill>
-                  <w14:solidFill>
-                    <w14:srgbClr w14:val="FF0000"/>
-                  </w14:solidFill>
-                </w14:textFill>
-              </w:rPr>
+                <w:rtl w:val="0"/>
+                <w:lang w:val="en-US"/>
+              </w:rPr>
+              <w:t>$</w:t>
+            </w:r>
+            <w:r>
+              <w:rPr>
+                <w:rFonts w:ascii="Arial" w:hAnsi="Arial"/>
+                <w:b w:val="1"/>
+                <w:bCs w:val="1"/>
+                <w:sz w:val="18"/>
+                <w:szCs w:val="18"/>
+                <w:u w:color="ff0000"/>
+                <w:shd w:val="nil" w:color="auto" w:fill="auto"/>
+                <w:rtl w:val="0"/>
+                <w:lang w:val="en-US"/>
+              </w:rPr>
+              <w:t>{end}</w:t>
             </w:r>
           </w:p>
         </w:tc>
@@ -2229,13 +2140,13 @@
           <w:shd w:val="clear" w:color="auto" w:fill="ced7e7"/>
         </w:tblPrEx>
         <w:trPr>
-          <w:trHeight w:val="1405" w:hRule="atLeast"/>
+          <w:trHeight w:val="1425" w:hRule="atLeast"/>
         </w:trPr>
         <w:tc>
           <w:tcPr>
-            <w:tcW w:type="dxa" w:w="2692"/>
+            <w:tcW w:type="dxa" w:w="2634"/>
             <w:tcBorders>
-              <w:top w:val="single" w:color="000000" w:sz="4" w:space="0" w:shadow="0" w:frame="0"/>
+              <w:top w:val="single" w:color="525252" w:sz="4" w:space="0" w:shadow="0" w:frame="0"/>
               <w:left w:val="single" w:color="000000" w:sz="4" w:space="0" w:shadow="0" w:frame="0"/>
               <w:bottom w:val="single" w:color="000000" w:sz="4" w:space="0" w:shadow="0" w:frame="0"/>
               <w:right w:val="nil"/>
@@ -2385,9 +2296,9 @@
         </w:tc>
         <w:tc>
           <w:tcPr>
-            <w:tcW w:type="dxa" w:w="4764"/>
+            <w:tcW w:type="dxa" w:w="4662"/>
             <w:tcBorders>
-              <w:top w:val="single" w:color="7f7f7f" w:sz="8" w:space="0" w:shadow="0" w:frame="0"/>
+              <w:top w:val="single" w:color="a7a7a7" w:sz="8" w:space="0" w:shadow="0" w:frame="0"/>
               <w:left w:val="nil"/>
               <w:bottom w:val="single" w:color="7f7f7f" w:sz="8" w:space="0" w:shadow="0" w:frame="0"/>
               <w:right w:val="single" w:color="7f7f7f" w:sz="8" w:space="0" w:shadow="0" w:frame="0"/>
@@ -2403,7 +2314,7 @@
           </w:tcPr>
           <w:p>
             <w:pPr>
-              <w:pStyle w:val="Body"/>
+              <w:pStyle w:val="Body A"/>
               <w:tabs>
                 <w:tab w:val="left" w:pos="1010"/>
                 <w:tab w:val="left" w:pos="1190"/>
@@ -2415,10 +2326,6 @@
                 <w:szCs w:val="22"/>
                 <w:shd w:val="nil" w:color="auto" w:fill="auto"/>
                 <w:lang w:val="en-US"/>
-                <w14:textOutline w14:w="12700" w14:cap="flat">
-                  <w14:noFill/>
-                  <w14:miter w14:lim="400000"/>
-                </w14:textOutline>
               </w:rPr>
             </w:pPr>
           </w:p>
@@ -2498,35 +2405,21 @@
             </w:r>
             <w:r>
               <w:rPr>
-                <w:outline w:val="0"/>
-                <w:color w:val="000000"/>
+                <w:sz w:val="16"/>
+                <w:szCs w:val="16"/>
+                <w:rtl w:val="0"/>
+                <w:lang w:val="en-US"/>
+              </w:rPr>
+              <w:t>$</w:t>
+            </w:r>
+            <w:r>
+              <w:rPr>
                 <w:sz w:val="16"/>
                 <w:szCs w:val="16"/>
                 <w:u w:color="ff0000"/>
-                <w:rtl w:val="0"/>
-                <w:lang w:val="en-US"/>
-                <w14:textFill>
-                  <w14:solidFill>
-                    <w14:srgbClr w14:val="000000"/>
-                  </w14:solidFill>
-                </w14:textFill>
-              </w:rPr>
-              <w:t>$</w:t>
-            </w:r>
-            <w:r>
-              <w:rPr>
-                <w:outline w:val="0"/>
-                <w:color w:val="000000"/>
-                <w:sz w:val="16"/>
-                <w:szCs w:val="16"/>
-                <w:u w:color="ff0000"/>
+                <w:shd w:val="nil" w:color="auto" w:fill="auto"/>
                 <w:rtl w:val="0"/>
                 <w:lang w:val="it-IT"/>
-                <w14:textFill>
-                  <w14:solidFill>
-                    <w14:srgbClr w14:val="000000"/>
-                  </w14:solidFill>
-                </w14:textFill>
               </w:rPr>
               <w:t>{</w:t>
             </w:r>
@@ -2556,10 +2449,10 @@
         </w:tc>
         <w:tc>
           <w:tcPr>
-            <w:tcW w:type="dxa" w:w="2662"/>
+            <w:tcW w:type="dxa" w:w="2605"/>
             <w:gridSpan w:val="2"/>
             <w:tcBorders>
-              <w:top w:val="single" w:color="000000" w:sz="4" w:space="0" w:shadow="0" w:frame="0"/>
+              <w:top w:val="single" w:color="525252" w:sz="4" w:space="0" w:shadow="0" w:frame="0"/>
               <w:left w:val="single" w:color="7f7f7f" w:sz="8" w:space="0" w:shadow="0" w:frame="0"/>
               <w:bottom w:val="single" w:color="000000" w:sz="4" w:space="0" w:shadow="0" w:frame="0"/>
               <w:right w:val="single" w:color="000000" w:sz="4" w:space="0" w:shadow="0" w:frame="0"/>
@@ -2755,6 +2648,26 @@
         </w:tc>
       </w:tr>
     </w:tbl>
+    <w:p>
+      <w:pPr>
+        <w:pStyle w:val="Standard"/>
+        <w:widowControl w:val="0"/>
+        <w:ind w:left="286" w:hanging="286"/>
+        <w:rPr>
+          <w:rFonts w:ascii="Arial" w:cs="Arial" w:hAnsi="Arial" w:eastAsia="Arial"/>
+          <w:outline w:val="0"/>
+          <w:color w:val="ff0000"/>
+          <w:sz w:val="10"/>
+          <w:szCs w:val="10"/>
+          <w:u w:color="ff0000"/>
+          <w14:textFill>
+            <w14:solidFill>
+              <w14:srgbClr w14:val="FF0000"/>
+            </w14:solidFill>
+          </w14:textFill>
+        </w:rPr>
+      </w:pPr>
+    </w:p>
     <w:p>
       <w:pPr>
         <w:pStyle w:val="Standard"/>
@@ -2856,7 +2769,7 @@
       <w:tblPr>
         <w:tblW w:w="9867" w:type="dxa"/>
         <w:jc w:val="left"/>
-        <w:tblInd w:w="522" w:type="dxa"/>
+        <w:tblInd w:w="630" w:type="dxa"/>
         <w:tblBorders>
           <w:top w:val="single" w:color="ffffff" w:sz="8" w:space="0" w:shadow="0" w:frame="0"/>
           <w:left w:val="single" w:color="ffffff" w:sz="8" w:space="0" w:shadow="0" w:frame="0"/>
@@ -2877,7 +2790,7 @@
           <w:shd w:val="clear" w:color="auto" w:fill="ced7e7"/>
         </w:tblPrEx>
         <w:trPr>
-          <w:trHeight w:val="267" w:hRule="atLeast"/>
+          <w:trHeight w:val="277" w:hRule="atLeast"/>
         </w:trPr>
         <w:tc>
           <w:tcPr>
@@ -2923,7 +2836,77 @@
           <w:shd w:val="clear" w:color="auto" w:fill="ced7e7"/>
         </w:tblPrEx>
         <w:trPr>
-          <w:trHeight w:val="706" w:hRule="atLeast"/>
+          <w:trHeight w:val="506" w:hRule="atLeast"/>
+        </w:trPr>
+        <w:tc>
+          <w:tcPr>
+            <w:tcW w:type="dxa" w:w="1078"/>
+            <w:tcBorders>
+              <w:top w:val="single" w:color="000000" w:sz="4" w:space="0" w:shadow="0" w:frame="0"/>
+              <w:left w:val="single" w:color="000000" w:sz="4" w:space="0" w:shadow="0" w:frame="0"/>
+              <w:bottom w:val="single" w:color="000000" w:sz="4" w:space="0" w:shadow="0" w:frame="0"/>
+              <w:right w:val="single" w:color="000000" w:sz="4" w:space="0" w:shadow="0" w:frame="0"/>
+            </w:tcBorders>
+            <w:shd w:val="clear" w:color="auto" w:fill="auto"/>
+            <w:tcMar>
+              <w:top w:type="dxa" w:w="80"/>
+              <w:left w:type="dxa" w:w="80"/>
+              <w:bottom w:type="dxa" w:w="80"/>
+              <w:right w:type="dxa" w:w="80"/>
+            </w:tcMar>
+            <w:vAlign w:val="top"/>
+          </w:tcPr>
+          <w:p>
+            <w:pPr>
+              <w:pStyle w:val="Standard"/>
+              <w:spacing w:after="40"/>
+              <w:jc w:val="center"/>
+            </w:pPr>
+            <w:r>
+              <w:rPr>
+                <w:rtl w:val="0"/>
+                <w:lang w:val="en-US"/>
+              </w:rPr>
+              <w:t>$</w:t>
+            </w:r>
+            <w:r>
+              <w:rPr>
+                <w:rFonts w:ascii="Calibri" w:hAnsi="Calibri"/>
+                <w:shd w:val="nil" w:color="auto" w:fill="auto"/>
+                <w:rtl w:val="0"/>
+                <w:lang w:val="en-US"/>
+              </w:rPr>
+              <w:t>{start}</w:t>
+            </w:r>
+          </w:p>
+        </w:tc>
+        <w:tc>
+          <w:tcPr>
+            <w:tcW w:type="dxa" w:w="8789"/>
+            <w:tcBorders>
+              <w:top w:val="single" w:color="000000" w:sz="4" w:space="0" w:shadow="0" w:frame="0"/>
+              <w:left w:val="single" w:color="000000" w:sz="4" w:space="0" w:shadow="0" w:frame="0"/>
+              <w:bottom w:val="single" w:color="000000" w:sz="4" w:space="0" w:shadow="0" w:frame="0"/>
+              <w:right w:val="single" w:color="000000" w:sz="4" w:space="0" w:shadow="0" w:frame="0"/>
+            </w:tcBorders>
+            <w:shd w:val="clear" w:color="auto" w:fill="auto"/>
+            <w:tcMar>
+              <w:top w:type="dxa" w:w="80"/>
+              <w:left w:type="dxa" w:w="80"/>
+              <w:bottom w:type="dxa" w:w="80"/>
+              <w:right w:type="dxa" w:w="80"/>
+            </w:tcMar>
+            <w:vAlign w:val="top"/>
+          </w:tcPr>
+          <w:p/>
+        </w:tc>
+      </w:tr>
+      <w:tr>
+        <w:tblPrEx>
+          <w:shd w:val="clear" w:color="auto" w:fill="ced7e7"/>
+        </w:tblPrEx>
+        <w:trPr>
+          <w:trHeight w:val="310" w:hRule="atLeast"/>
         </w:trPr>
         <w:tc>
           <w:tcPr>
@@ -2943,47 +2926,7 @@
             </w:tcMar>
             <w:vAlign w:val="top"/>
           </w:tcPr>
-          <w:p>
-            <w:pPr>
-              <w:pStyle w:val="Standard"/>
-              <w:spacing w:after="40"/>
-              <w:jc w:val="center"/>
-            </w:pPr>
-            <w:r>
-              <w:rPr>
-                <w:rtl w:val="0"/>
-                <w:lang w:val="en-US"/>
-              </w:rPr>
-              <w:t>$</w:t>
-            </w:r>
-            <w:r>
-              <w:rPr>
-                <w:rFonts w:ascii="Calibri" w:hAnsi="Calibri"/>
-                <w:shd w:val="nil" w:color="auto" w:fill="auto"/>
-                <w:rtl w:val="0"/>
-                <w:lang w:val="en-US"/>
-              </w:rPr>
-              <w:t>{</w:t>
-            </w:r>
-            <w:r>
-              <w:rPr>
-                <w:rFonts w:ascii="Calibri" w:hAnsi="Calibri"/>
-                <w:shd w:val="nil" w:color="auto" w:fill="auto"/>
-                <w:rtl w:val="0"/>
-                <w:lang w:val="de-DE"/>
-              </w:rPr>
-              <w:t>uhrzeit_beginn</w:t>
-            </w:r>
-            <w:r>
-              <w:rPr>
-                <w:rFonts w:ascii="Calibri" w:hAnsi="Calibri"/>
-                <w:shd w:val="nil" w:color="auto" w:fill="auto"/>
-                <w:rtl w:val="0"/>
-                <w:lang w:val="en-US"/>
-              </w:rPr>
-              <w:t>}</w:t>
-            </w:r>
-          </w:p>
+          <w:p/>
         </w:tc>
         <w:tc>
           <w:tcPr>
@@ -2994,7 +2937,7 @@
               <w:bottom w:val="single" w:color="000000" w:sz="4" w:space="0" w:shadow="0" w:frame="0"/>
               <w:right w:val="single" w:color="000000" w:sz="4" w:space="0" w:shadow="0" w:frame="0"/>
             </w:tcBorders>
-            <w:shd w:val="clear" w:color="auto" w:fill="ffffff"/>
+            <w:shd w:val="clear" w:color="auto" w:fill="auto"/>
             <w:tcMar>
               <w:top w:type="dxa" w:w="80"/>
               <w:left w:type="dxa" w:w="80"/>
@@ -3011,7 +2954,55 @@
           <w:shd w:val="clear" w:color="auto" w:fill="ced7e7"/>
         </w:tblPrEx>
         <w:trPr>
-          <w:trHeight w:val="300" w:hRule="atLeast"/>
+          <w:trHeight w:val="310" w:hRule="atLeast"/>
+        </w:trPr>
+        <w:tc>
+          <w:tcPr>
+            <w:tcW w:type="dxa" w:w="1078"/>
+            <w:tcBorders>
+              <w:top w:val="single" w:color="000000" w:sz="4" w:space="0" w:shadow="0" w:frame="0"/>
+              <w:left w:val="single" w:color="000000" w:sz="4" w:space="0" w:shadow="0" w:frame="0"/>
+              <w:bottom w:val="single" w:color="000000" w:sz="4" w:space="0" w:shadow="0" w:frame="0"/>
+              <w:right w:val="single" w:color="000000" w:sz="4" w:space="0" w:shadow="0" w:frame="0"/>
+            </w:tcBorders>
+            <w:shd w:val="clear" w:color="auto" w:fill="auto"/>
+            <w:tcMar>
+              <w:top w:type="dxa" w:w="80"/>
+              <w:left w:type="dxa" w:w="80"/>
+              <w:bottom w:type="dxa" w:w="80"/>
+              <w:right w:type="dxa" w:w="80"/>
+            </w:tcMar>
+            <w:vAlign w:val="top"/>
+          </w:tcPr>
+          <w:p/>
+        </w:tc>
+        <w:tc>
+          <w:tcPr>
+            <w:tcW w:type="dxa" w:w="8789"/>
+            <w:tcBorders>
+              <w:top w:val="single" w:color="000000" w:sz="4" w:space="0" w:shadow="0" w:frame="0"/>
+              <w:left w:val="single" w:color="000000" w:sz="4" w:space="0" w:shadow="0" w:frame="0"/>
+              <w:bottom w:val="single" w:color="000000" w:sz="4" w:space="0" w:shadow="0" w:frame="0"/>
+              <w:right w:val="single" w:color="000000" w:sz="4" w:space="0" w:shadow="0" w:frame="0"/>
+            </w:tcBorders>
+            <w:shd w:val="clear" w:color="auto" w:fill="auto"/>
+            <w:tcMar>
+              <w:top w:type="dxa" w:w="80"/>
+              <w:left w:type="dxa" w:w="80"/>
+              <w:bottom w:type="dxa" w:w="80"/>
+              <w:right w:type="dxa" w:w="80"/>
+            </w:tcMar>
+            <w:vAlign w:val="top"/>
+          </w:tcPr>
+          <w:p/>
+        </w:tc>
+      </w:tr>
+      <w:tr>
+        <w:tblPrEx>
+          <w:shd w:val="clear" w:color="auto" w:fill="ced7e7"/>
+        </w:tblPrEx>
+        <w:trPr>
+          <w:trHeight w:val="310" w:hRule="atLeast"/>
         </w:trPr>
         <w:tc>
           <w:tcPr>
@@ -3059,103 +3050,7 @@
           <w:shd w:val="clear" w:color="auto" w:fill="ced7e7"/>
         </w:tblPrEx>
         <w:trPr>
-          <w:trHeight w:val="300" w:hRule="atLeast"/>
-        </w:trPr>
-        <w:tc>
-          <w:tcPr>
-            <w:tcW w:type="dxa" w:w="1078"/>
-            <w:tcBorders>
-              <w:top w:val="single" w:color="000000" w:sz="4" w:space="0" w:shadow="0" w:frame="0"/>
-              <w:left w:val="single" w:color="000000" w:sz="4" w:space="0" w:shadow="0" w:frame="0"/>
-              <w:bottom w:val="single" w:color="000000" w:sz="4" w:space="0" w:shadow="0" w:frame="0"/>
-              <w:right w:val="single" w:color="000000" w:sz="4" w:space="0" w:shadow="0" w:frame="0"/>
-            </w:tcBorders>
-            <w:shd w:val="clear" w:color="auto" w:fill="ffffff"/>
-            <w:tcMar>
-              <w:top w:type="dxa" w:w="80"/>
-              <w:left w:type="dxa" w:w="80"/>
-              <w:bottom w:type="dxa" w:w="80"/>
-              <w:right w:type="dxa" w:w="80"/>
-            </w:tcMar>
-            <w:vAlign w:val="top"/>
-          </w:tcPr>
-          <w:p/>
-        </w:tc>
-        <w:tc>
-          <w:tcPr>
-            <w:tcW w:type="dxa" w:w="8789"/>
-            <w:tcBorders>
-              <w:top w:val="single" w:color="000000" w:sz="4" w:space="0" w:shadow="0" w:frame="0"/>
-              <w:left w:val="single" w:color="000000" w:sz="4" w:space="0" w:shadow="0" w:frame="0"/>
-              <w:bottom w:val="single" w:color="000000" w:sz="4" w:space="0" w:shadow="0" w:frame="0"/>
-              <w:right w:val="single" w:color="000000" w:sz="4" w:space="0" w:shadow="0" w:frame="0"/>
-            </w:tcBorders>
-            <w:shd w:val="clear" w:color="auto" w:fill="ffffff"/>
-            <w:tcMar>
-              <w:top w:type="dxa" w:w="80"/>
-              <w:left w:type="dxa" w:w="80"/>
-              <w:bottom w:type="dxa" w:w="80"/>
-              <w:right w:type="dxa" w:w="80"/>
-            </w:tcMar>
-            <w:vAlign w:val="top"/>
-          </w:tcPr>
-          <w:p/>
-        </w:tc>
-      </w:tr>
-      <w:tr>
-        <w:tblPrEx>
-          <w:shd w:val="clear" w:color="auto" w:fill="ced7e7"/>
-        </w:tblPrEx>
-        <w:trPr>
-          <w:trHeight w:val="300" w:hRule="atLeast"/>
-        </w:trPr>
-        <w:tc>
-          <w:tcPr>
-            <w:tcW w:type="dxa" w:w="1078"/>
-            <w:tcBorders>
-              <w:top w:val="single" w:color="000000" w:sz="4" w:space="0" w:shadow="0" w:frame="0"/>
-              <w:left w:val="single" w:color="000000" w:sz="4" w:space="0" w:shadow="0" w:frame="0"/>
-              <w:bottom w:val="single" w:color="000000" w:sz="4" w:space="0" w:shadow="0" w:frame="0"/>
-              <w:right w:val="single" w:color="000000" w:sz="4" w:space="0" w:shadow="0" w:frame="0"/>
-            </w:tcBorders>
-            <w:shd w:val="clear" w:color="auto" w:fill="ffffff"/>
-            <w:tcMar>
-              <w:top w:type="dxa" w:w="80"/>
-              <w:left w:type="dxa" w:w="80"/>
-              <w:bottom w:type="dxa" w:w="80"/>
-              <w:right w:type="dxa" w:w="80"/>
-            </w:tcMar>
-            <w:vAlign w:val="top"/>
-          </w:tcPr>
-          <w:p/>
-        </w:tc>
-        <w:tc>
-          <w:tcPr>
-            <w:tcW w:type="dxa" w:w="8789"/>
-            <w:tcBorders>
-              <w:top w:val="single" w:color="000000" w:sz="4" w:space="0" w:shadow="0" w:frame="0"/>
-              <w:left w:val="single" w:color="000000" w:sz="4" w:space="0" w:shadow="0" w:frame="0"/>
-              <w:bottom w:val="single" w:color="000000" w:sz="4" w:space="0" w:shadow="0" w:frame="0"/>
-              <w:right w:val="single" w:color="000000" w:sz="4" w:space="0" w:shadow="0" w:frame="0"/>
-            </w:tcBorders>
-            <w:shd w:val="clear" w:color="auto" w:fill="ffffff"/>
-            <w:tcMar>
-              <w:top w:type="dxa" w:w="80"/>
-              <w:left w:type="dxa" w:w="80"/>
-              <w:bottom w:type="dxa" w:w="80"/>
-              <w:right w:type="dxa" w:w="80"/>
-            </w:tcMar>
-            <w:vAlign w:val="top"/>
-          </w:tcPr>
-          <w:p/>
-        </w:tc>
-      </w:tr>
-      <w:tr>
-        <w:tblPrEx>
-          <w:shd w:val="clear" w:color="auto" w:fill="ced7e7"/>
-        </w:tblPrEx>
-        <w:trPr>
-          <w:trHeight w:val="706" w:hRule="atLeast"/>
+          <w:trHeight w:val="506" w:hRule="atLeast"/>
         </w:trPr>
         <w:tc>
           <w:tcPr>
@@ -3195,7 +3090,25 @@
                 <w:rtl w:val="0"/>
                 <w:lang w:val="de-DE"/>
               </w:rPr>
-              <w:t>{uhrzeit_ende}</w:t>
+              <w:t>{</w:t>
+            </w:r>
+            <w:r>
+              <w:rPr>
+                <w:rFonts w:ascii="Calibri" w:hAnsi="Calibri"/>
+                <w:shd w:val="nil" w:color="auto" w:fill="auto"/>
+                <w:rtl w:val="0"/>
+                <w:lang w:val="en-US"/>
+              </w:rPr>
+              <w:t>end</w:t>
+            </w:r>
+            <w:r>
+              <w:rPr>
+                <w:rFonts w:ascii="Calibri" w:hAnsi="Calibri"/>
+                <w:shd w:val="nil" w:color="auto" w:fill="auto"/>
+                <w:rtl w:val="0"/>
+                <w:lang w:val="de-DE"/>
+              </w:rPr>
+              <w:t>}</w:t>
             </w:r>
           </w:p>
         </w:tc>
@@ -3221,6 +3134,27 @@
         </w:tc>
       </w:tr>
     </w:tbl>
+    <w:p>
+      <w:pPr>
+        <w:pStyle w:val="Standard"/>
+        <w:widowControl w:val="0"/>
+        <w:ind w:left="522" w:hanging="522"/>
+        <w:rPr>
+          <w:b w:val="1"/>
+          <w:bCs w:val="1"/>
+          <w:outline w:val="0"/>
+          <w:color w:val="ff0000"/>
+          <w:sz w:val="18"/>
+          <w:szCs w:val="18"/>
+          <w:u w:color="ff0000"/>
+          <w14:textFill>
+            <w14:solidFill>
+              <w14:srgbClr w14:val="FF0000"/>
+            </w14:solidFill>
+          </w14:textFill>
+        </w:rPr>
+      </w:pPr>
+    </w:p>
     <w:p>
       <w:pPr>
         <w:pStyle w:val="Standard"/>
@@ -3381,7 +3315,7 @@
       <w:tblPr>
         <w:tblW w:w="10260" w:type="dxa"/>
         <w:jc w:val="left"/>
-        <w:tblInd w:w="246" w:type="dxa"/>
+        <w:tblInd w:w="354" w:type="dxa"/>
         <w:tblBorders>
           <w:top w:val="single" w:color="ffffff" w:sz="8" w:space="0" w:shadow="0" w:frame="0"/>
           <w:left w:val="single" w:color="ffffff" w:sz="8" w:space="0" w:shadow="0" w:frame="0"/>
@@ -3402,7 +3336,7 @@
           <w:shd w:val="clear" w:color="auto" w:fill="ced7e7"/>
         </w:tblPrEx>
         <w:trPr>
-          <w:trHeight w:val="300" w:hRule="atLeast"/>
+          <w:trHeight w:val="310" w:hRule="atLeast"/>
         </w:trPr>
         <w:tc>
           <w:tcPr>
@@ -3462,7 +3396,7 @@
           <w:shd w:val="clear" w:color="auto" w:fill="ced7e7"/>
         </w:tblPrEx>
         <w:trPr>
-          <w:trHeight w:val="300" w:hRule="atLeast"/>
+          <w:trHeight w:val="310" w:hRule="atLeast"/>
         </w:trPr>
         <w:tc>
           <w:tcPr>
@@ -3527,7 +3461,7 @@
           <w:shd w:val="clear" w:color="auto" w:fill="ced7e7"/>
         </w:tblPrEx>
         <w:trPr>
-          <w:trHeight w:val="414" w:hRule="atLeast"/>
+          <w:trHeight w:val="424" w:hRule="atLeast"/>
         </w:trPr>
         <w:tc>
           <w:tcPr>
@@ -3592,7 +3526,7 @@
           <w:shd w:val="clear" w:color="auto" w:fill="ced7e7"/>
         </w:tblPrEx>
         <w:trPr>
-          <w:trHeight w:val="300" w:hRule="atLeast"/>
+          <w:trHeight w:val="310" w:hRule="atLeast"/>
         </w:trPr>
         <w:tc>
           <w:tcPr>
@@ -3653,6 +3587,27 @@
         </w:tc>
       </w:tr>
     </w:tbl>
+    <w:p>
+      <w:pPr>
+        <w:pStyle w:val="Standard"/>
+        <w:widowControl w:val="0"/>
+        <w:ind w:left="246" w:hanging="246"/>
+        <w:rPr>
+          <w:b w:val="1"/>
+          <w:bCs w:val="1"/>
+          <w:outline w:val="0"/>
+          <w:color w:val="ff0000"/>
+          <w:sz w:val="10"/>
+          <w:szCs w:val="10"/>
+          <w:u w:color="ff0000"/>
+          <w14:textFill>
+            <w14:solidFill>
+              <w14:srgbClr w14:val="FF0000"/>
+            </w14:solidFill>
+          </w14:textFill>
+        </w:rPr>
+      </w:pPr>
+    </w:p>
     <w:p>
       <w:pPr>
         <w:pStyle w:val="Standard"/>
@@ -3860,7 +3815,6 @@
       </w:rPr>
       <w:t>+49 (0)170 9381111, trucken@timeprints.de</w:t>
     </w:r>
-    <w:r/>
   </w:p>
 </w:ftr>
 </file>
@@ -3937,13 +3891,6 @@
         </w14:textFill>
       </w:rPr>
       <w:t>(sonstige Beteiligte)</w:t>
-    </w:r>
-    <w:r>
-      <w:rPr>
-        <w:rFonts w:ascii="Arial" w:cs="Arial" w:hAnsi="Arial" w:eastAsia="Arial"/>
-        <w:sz w:val="14"/>
-        <w:szCs w:val="14"/>
-      </w:rPr>
     </w:r>
   </w:p>
 </w:hdr>
@@ -4230,7 +4177,7 @@
       <w:spacing w:before="0" w:after="0" w:line="240" w:lineRule="auto"/>
       <w:ind w:left="0" w:right="0" w:firstLine="0"/>
       <w:jc w:val="center"/>
-      <w:outlineLvl w:val="1"/>
+      <w:outlineLvl w:val="0"/>
     </w:pPr>
     <w:rPr>
       <w:rFonts w:ascii="Arial" w:cs="Arial" w:hAnsi="Arial" w:eastAsia="Arial"/>
@@ -4277,7 +4224,7 @@
       <w:outlineLvl w:val="9"/>
     </w:pPr>
     <w:rPr>
-      <w:rFonts w:ascii="Arial" w:cs="Arial" w:hAnsi="Arial" w:eastAsia="Arial"/>
+      <w:rFonts w:ascii="Arial" w:cs="Arial Unicode MS" w:hAnsi="Arial" w:eastAsia="Arial Unicode MS"/>
       <w:b w:val="0"/>
       <w:bCs w:val="0"/>
       <w:i w:val="0"/>
@@ -4297,52 +4244,6 @@
       <w:shd w:val="nil" w:color="auto" w:fill="auto"/>
       <w:vertAlign w:val="baseline"/>
       <w:lang w:val="de-DE"/>
-      <w14:textFill>
-        <w14:solidFill>
-          <w14:srgbClr w14:val="000000"/>
-        </w14:solidFill>
-      </w14:textFill>
-    </w:rPr>
-  </w:style>
-  <w:style w:type="paragraph" w:styleId="Body">
-    <w:name w:val="Body"/>
-    <w:next w:val="Body"/>
-    <w:pPr>
-      <w:keepNext w:val="0"/>
-      <w:keepLines w:val="0"/>
-      <w:pageBreakBefore w:val="0"/>
-      <w:widowControl w:val="1"/>
-      <w:shd w:val="clear" w:color="auto" w:fill="auto"/>
-      <w:suppressAutoHyphens w:val="0"/>
-      <w:bidi w:val="0"/>
-      <w:spacing w:before="0" w:after="0" w:line="240" w:lineRule="auto"/>
-      <w:ind w:left="0" w:right="0" w:firstLine="0"/>
-      <w:jc w:val="left"/>
-      <w:outlineLvl w:val="9"/>
-    </w:pPr>
-    <w:rPr>
-      <w:rFonts w:ascii="Times New Roman" w:cs="Times New Roman" w:hAnsi="Times New Roman" w:eastAsia="Times New Roman"/>
-      <w:b w:val="0"/>
-      <w:bCs w:val="0"/>
-      <w:i w:val="0"/>
-      <w:iCs w:val="0"/>
-      <w:caps w:val="0"/>
-      <w:smallCaps w:val="0"/>
-      <w:strike w:val="0"/>
-      <w:dstrike w:val="0"/>
-      <w:outline w:val="0"/>
-      <w:color w:val="000000"/>
-      <w:spacing w:val="0"/>
-      <w:kern w:val="0"/>
-      <w:position w:val="0"/>
-      <w:sz w:val="24"/>
-      <w:szCs w:val="24"/>
-      <w:u w:val="none" w:color="000000"/>
-      <w:shd w:val="nil" w:color="auto" w:fill="auto"/>
-      <w:vertAlign w:val="baseline"/>
-      <w14:textOutline>
-        <w14:noFill/>
-      </w14:textOutline>
       <w14:textFill>
         <w14:solidFill>
           <w14:srgbClr w14:val="000000"/>
@@ -4387,6 +4288,53 @@
       <w:shd w:val="nil" w:color="auto" w:fill="auto"/>
       <w:vertAlign w:val="baseline"/>
       <w:lang w:val="de-DE"/>
+      <w14:textFill>
+        <w14:solidFill>
+          <w14:srgbClr w14:val="000000"/>
+        </w14:solidFill>
+      </w14:textFill>
+    </w:rPr>
+  </w:style>
+  <w:style w:type="paragraph" w:styleId="Body A">
+    <w:name w:val="Body A"/>
+    <w:next w:val="Body A"/>
+    <w:pPr>
+      <w:keepNext w:val="0"/>
+      <w:keepLines w:val="0"/>
+      <w:pageBreakBefore w:val="0"/>
+      <w:widowControl w:val="1"/>
+      <w:shd w:val="clear" w:color="auto" w:fill="auto"/>
+      <w:suppressAutoHyphens w:val="0"/>
+      <w:bidi w:val="0"/>
+      <w:spacing w:before="0" w:after="0" w:line="240" w:lineRule="auto"/>
+      <w:ind w:left="0" w:right="0" w:firstLine="0"/>
+      <w:jc w:val="left"/>
+      <w:outlineLvl w:val="9"/>
+    </w:pPr>
+    <w:rPr>
+      <w:rFonts w:ascii="Times New Roman" w:cs="Times New Roman" w:hAnsi="Times New Roman" w:eastAsia="Times New Roman"/>
+      <w:b w:val="0"/>
+      <w:bCs w:val="0"/>
+      <w:i w:val="0"/>
+      <w:iCs w:val="0"/>
+      <w:caps w:val="0"/>
+      <w:smallCaps w:val="0"/>
+      <w:strike w:val="0"/>
+      <w:dstrike w:val="0"/>
+      <w:outline w:val="0"/>
+      <w:color w:val="000000"/>
+      <w:spacing w:val="0"/>
+      <w:kern w:val="0"/>
+      <w:position w:val="0"/>
+      <w:sz w:val="24"/>
+      <w:szCs w:val="24"/>
+      <w:u w:val="none" w:color="000000"/>
+      <w:shd w:val="nil" w:color="auto" w:fill="auto"/>
+      <w:vertAlign w:val="baseline"/>
+      <w14:textOutline w14:w="12700" w14:cap="flat">
+        <w14:noFill/>
+        <w14:miter w14:lim="400000"/>
+      </w14:textOutline>
       <w14:textFill>
         <w14:solidFill>
           <w14:srgbClr w14:val="000000"/>
@@ -4452,7 +4400,7 @@
       <w:spacing w:before="0" w:after="0" w:line="240" w:lineRule="auto"/>
       <w:ind w:left="0" w:right="0" w:firstLine="0"/>
       <w:jc w:val="left"/>
-      <w:outlineLvl w:val="1"/>
+      <w:outlineLvl w:val="0"/>
     </w:pPr>
     <w:rPr>
       <w:rFonts w:ascii="Arial" w:cs="Arial Unicode MS" w:hAnsi="Arial" w:eastAsia="Arial Unicode MS"/>

</xml_diff>

<commit_message>
Add weather related data
</commit_message>
<xml_diff>
--- a/templates/doc_template.docx
+++ b/templates/doc_template.docx
@@ -47,7 +47,7 @@
               <wp:posOffset>-634</wp:posOffset>
             </wp:positionH>
             <wp:positionV relativeFrom="line">
-              <wp:posOffset>20952</wp:posOffset>
+              <wp:posOffset>20951</wp:posOffset>
             </wp:positionV>
             <wp:extent cx="1098551" cy="981076"/>
             <wp:effectExtent l="0" t="0" r="0" b="0"/>
@@ -780,7 +780,7 @@
       <w:tblPr>
         <w:tblW w:w="9902" w:type="dxa"/>
         <w:jc w:val="left"/>
-        <w:tblInd w:w="394" w:type="dxa"/>
+        <w:tblInd w:w="502" w:type="dxa"/>
         <w:tblBorders>
           <w:top w:val="single" w:color="ffffff" w:sz="8" w:space="0" w:shadow="0" w:frame="0"/>
           <w:left w:val="single" w:color="ffffff" w:sz="8" w:space="0" w:shadow="0" w:frame="0"/>
@@ -803,7 +803,7 @@
           <w:shd w:val="clear" w:color="auto" w:fill="ced7e7"/>
         </w:tblPrEx>
         <w:trPr>
-          <w:trHeight w:val="330" w:hRule="atLeast"/>
+          <w:trHeight w:val="350" w:hRule="atLeast"/>
         </w:trPr>
         <w:tc>
           <w:tcPr>
@@ -847,7 +847,7 @@
         </w:tc>
         <w:tc>
           <w:tcPr>
-            <w:tcW w:type="dxa" w:w="2605"/>
+            <w:tcW w:type="dxa" w:w="2606"/>
             <w:gridSpan w:val="2"/>
             <w:tcBorders>
               <w:top w:val="single" w:color="000000" w:sz="4" w:space="0" w:shadow="0" w:frame="0"/>
@@ -889,7 +889,7 @@
           <w:shd w:val="clear" w:color="auto" w:fill="ced7e7"/>
         </w:tblPrEx>
         <w:trPr>
-          <w:trHeight w:val="614" w:hRule="atLeast"/>
+          <w:trHeight w:val="634" w:hRule="atLeast"/>
         </w:trPr>
         <w:tc>
           <w:tcPr>
@@ -916,13 +916,8 @@
                 <w:tab w:val="left" w:pos="1010"/>
                 <w:tab w:val="left" w:pos="1190"/>
               </w:tabs>
-              <w:bidi w:val="0"/>
               <w:spacing w:line="360" w:lineRule="auto"/>
-              <w:ind w:left="110" w:right="0" w:hanging="110"/>
-              <w:jc w:val="left"/>
-              <w:rPr>
-                <w:rtl w:val="0"/>
-              </w:rPr>
+              <w:ind w:left="110" w:hanging="110"/>
             </w:pPr>
             <w:r>
               <w:rPr>
@@ -952,15 +947,6 @@
               <w:tab/>
               <w:tab/>
               <w:t xml:space="preserve">         </w:t>
-            </w:r>
-            <w:r>
-              <w:rPr>
-                <w:b w:val="1"/>
-                <w:bCs w:val="1"/>
-                <w:sz w:val="20"/>
-                <w:szCs w:val="20"/>
-                <w:shd w:val="nil" w:color="auto" w:fill="auto"/>
-              </w:rPr>
             </w:r>
           </w:p>
         </w:tc>
@@ -989,13 +975,8 @@
                 <w:tab w:val="left" w:pos="1010"/>
                 <w:tab w:val="left" w:pos="1190"/>
               </w:tabs>
-              <w:bidi w:val="0"/>
               <w:spacing w:line="360" w:lineRule="auto"/>
-              <w:ind w:left="110" w:right="0" w:hanging="110"/>
-              <w:jc w:val="left"/>
-              <w:rPr>
-                <w:rtl w:val="0"/>
-              </w:rPr>
+              <w:ind w:left="110" w:hanging="110"/>
             </w:pPr>
             <w:r>
               <w:rPr>
@@ -1007,19 +988,7 @@
                 <w:rtl w:val="0"/>
                 <w:lang w:val="en-US"/>
               </w:rPr>
-              <w:t>$</w:t>
-            </w:r>
-            <w:r>
-              <w:rPr>
-                <w:b w:val="1"/>
-                <w:bCs w:val="1"/>
-                <w:sz w:val="20"/>
-                <w:szCs w:val="20"/>
-                <w:shd w:val="nil" w:color="auto" w:fill="auto"/>
-                <w:rtl w:val="0"/>
-                <w:lang w:val="en-US"/>
-              </w:rPr>
-              <w:t>{ort}</w:t>
+              <w:t>${ort}</w:t>
             </w:r>
           </w:p>
         </w:tc>
@@ -1161,7 +1130,7 @@
         </w:tc>
         <w:tc>
           <w:tcPr>
-            <w:tcW w:type="dxa" w:w="1095"/>
+            <w:tcW w:type="dxa" w:w="1096"/>
             <w:tcBorders>
               <w:top w:val="single" w:color="525252" w:sz="4" w:space="0" w:shadow="0" w:frame="0"/>
               <w:left w:val="single" w:color="ffffff" w:sz="4" w:space="0" w:shadow="0" w:frame="0"/>
@@ -1185,7 +1154,7 @@
           <w:shd w:val="clear" w:color="auto" w:fill="ced7e7"/>
         </w:tblPrEx>
         <w:trPr>
-          <w:trHeight w:val="580" w:hRule="atLeast"/>
+          <w:trHeight w:val="600" w:hRule="atLeast"/>
         </w:trPr>
         <w:tc>
           <w:tcPr>
@@ -1213,13 +1182,8 @@
                 <w:tab w:val="left" w:pos="1190"/>
                 <w:tab w:val="left" w:pos="1370"/>
               </w:tabs>
-              <w:bidi w:val="0"/>
               <w:spacing w:line="360" w:lineRule="auto"/>
-              <w:ind w:left="110" w:right="0" w:hanging="110"/>
-              <w:jc w:val="left"/>
-              <w:rPr>
-                <w:rtl w:val="0"/>
-              </w:rPr>
+              <w:ind w:left="110" w:hanging="110"/>
             </w:pPr>
             <w:r>
               <w:rPr>
@@ -1248,15 +1212,6 @@
               <w:tab/>
               <w:tab/>
               <w:t xml:space="preserve">          </w:t>
-            </w:r>
-            <w:r>
-              <w:rPr>
-                <w:b w:val="1"/>
-                <w:bCs w:val="1"/>
-                <w:sz w:val="20"/>
-                <w:szCs w:val="20"/>
-                <w:shd w:val="nil" w:color="auto" w:fill="auto"/>
-              </w:rPr>
             </w:r>
           </w:p>
         </w:tc>
@@ -1286,13 +1241,8 @@
                 <w:tab w:val="left" w:pos="1190"/>
                 <w:tab w:val="left" w:pos="1370"/>
               </w:tabs>
-              <w:bidi w:val="0"/>
               <w:spacing w:line="360" w:lineRule="auto"/>
-              <w:ind w:left="110" w:right="0" w:hanging="110"/>
-              <w:jc w:val="left"/>
-              <w:rPr>
-                <w:rtl w:val="0"/>
-              </w:rPr>
+              <w:ind w:left="110" w:hanging="110"/>
             </w:pPr>
             <w:r>
               <w:rPr>
@@ -1304,28 +1254,7 @@
                 <w:rtl w:val="0"/>
                 <w:lang w:val="en-US"/>
               </w:rPr>
-              <w:t>$</w:t>
-            </w:r>
-            <w:r>
-              <w:rPr>
-                <w:b w:val="1"/>
-                <w:bCs w:val="1"/>
-                <w:sz w:val="20"/>
-                <w:szCs w:val="20"/>
-                <w:shd w:val="nil" w:color="auto" w:fill="auto"/>
-                <w:rtl w:val="0"/>
-                <w:lang w:val="en-US"/>
-              </w:rPr>
-              <w:t>{addresse}</w:t>
-            </w:r>
-            <w:r>
-              <w:rPr>
-                <w:b w:val="1"/>
-                <w:bCs w:val="1"/>
-                <w:sz w:val="20"/>
-                <w:szCs w:val="20"/>
-                <w:shd w:val="nil" w:color="auto" w:fill="auto"/>
-              </w:rPr>
+              <w:t>${addresse}</w:t>
             </w:r>
           </w:p>
         </w:tc>
@@ -1350,10 +1279,7 @@
           <w:p>
             <w:pPr>
               <w:pStyle w:val="AB"/>
-              <w:bidi w:val="0"/>
               <w:spacing w:line="240" w:lineRule="auto"/>
-              <w:ind w:left="0" w:right="0" w:firstLine="0"/>
-              <w:jc w:val="left"/>
               <w:rPr>
                 <w:rFonts w:ascii="Arial" w:cs="Arial" w:hAnsi="Arial" w:eastAsia="Arial"/>
                 <w:b w:val="1"/>
@@ -1361,7 +1287,6 @@
                 <w:sz w:val="18"/>
                 <w:szCs w:val="18"/>
                 <w:shd w:val="nil" w:color="auto" w:fill="auto"/>
-                <w:rtl w:val="0"/>
               </w:rPr>
             </w:pPr>
             <w:r>
@@ -1405,7 +1330,7 @@
         </w:tc>
         <w:tc>
           <w:tcPr>
-            <w:tcW w:type="dxa" w:w="1095"/>
+            <w:tcW w:type="dxa" w:w="1096"/>
             <w:tcBorders>
               <w:top w:val="single" w:color="ffffff" w:sz="4" w:space="0" w:shadow="0" w:frame="0"/>
               <w:left w:val="single" w:color="ffffff" w:sz="4" w:space="0" w:shadow="0" w:frame="0"/>
@@ -1429,7 +1354,7 @@
           <w:shd w:val="clear" w:color="auto" w:fill="ced7e7"/>
         </w:tblPrEx>
         <w:trPr>
-          <w:trHeight w:val="2034" w:hRule="atLeast"/>
+          <w:trHeight w:val="2054" w:hRule="atLeast"/>
         </w:trPr>
         <w:tc>
           <w:tcPr>
@@ -1457,13 +1382,8 @@
                 <w:tab w:val="left" w:pos="1190"/>
                 <w:tab w:val="left" w:pos="1370"/>
               </w:tabs>
-              <w:bidi w:val="0"/>
               <w:spacing w:line="360" w:lineRule="auto"/>
-              <w:ind w:left="110" w:right="0" w:hanging="110"/>
-              <w:jc w:val="left"/>
-              <w:rPr>
-                <w:rtl w:val="0"/>
-              </w:rPr>
+              <w:ind w:left="110" w:hanging="110"/>
             </w:pPr>
             <w:r>
               <w:rPr>
@@ -1518,17 +1438,14 @@
                 <w:tab w:val="left" w:pos="1190"/>
                 <w:tab w:val="left" w:pos="1370"/>
               </w:tabs>
-              <w:bidi w:val="0"/>
               <w:spacing w:line="360" w:lineRule="auto"/>
-              <w:ind w:left="110" w:right="0" w:hanging="110"/>
-              <w:jc w:val="left"/>
+              <w:ind w:left="110" w:hanging="110"/>
               <w:rPr>
                 <w:b w:val="1"/>
                 <w:bCs w:val="1"/>
                 <w:sz w:val="20"/>
                 <w:szCs w:val="20"/>
                 <w:shd w:val="nil" w:color="auto" w:fill="auto"/>
-                <w:rtl w:val="0"/>
               </w:rPr>
             </w:pPr>
             <w:r>
@@ -1541,19 +1458,7 @@
                 <w:rtl w:val="0"/>
                 <w:lang w:val="en-US"/>
               </w:rPr>
-              <w:t>$</w:t>
-            </w:r>
-            <w:r>
-              <w:rPr>
-                <w:b w:val="1"/>
-                <w:bCs w:val="1"/>
-                <w:sz w:val="20"/>
-                <w:szCs w:val="20"/>
-                <w:shd w:val="nil" w:color="auto" w:fill="auto"/>
-                <w:rtl w:val="0"/>
-                <w:lang w:val="en-US"/>
-              </w:rPr>
-              <w:t>{</w:t>
+              <w:t>${</w:t>
             </w:r>
             <w:r>
               <w:rPr>
@@ -1623,19 +1528,7 @@
                 <w:rtl w:val="0"/>
                 <w:lang w:val="en-US"/>
               </w:rPr>
-              <w:t xml:space="preserve"> </w:t>
-            </w:r>
-            <w:r>
-              <w:rPr>
-                <w:b w:val="0"/>
-                <w:bCs w:val="0"/>
-                <w:sz w:val="20"/>
-                <w:szCs w:val="20"/>
-                <w:shd w:val="nil" w:color="auto" w:fill="auto"/>
-                <w:rtl w:val="0"/>
-                <w:lang w:val="en-US"/>
-              </w:rPr>
-              <w:t>$</w:t>
+              <w:t xml:space="preserve"> $</w:t>
             </w:r>
             <w:r>
               <w:rPr>
@@ -1698,17 +1591,7 @@
                 <w:rtl w:val="0"/>
                 <w:lang w:val="en-US"/>
               </w:rPr>
-              <w:t xml:space="preserve">Mail: </w:t>
-            </w:r>
-            <w:r>
-              <w:rPr>
-                <w:sz w:val="20"/>
-                <w:szCs w:val="20"/>
-                <w:shd w:val="nil" w:color="auto" w:fill="auto"/>
-                <w:rtl w:val="0"/>
-                <w:lang w:val="en-US"/>
-              </w:rPr>
-              <w:t>$</w:t>
+              <w:t>Mail: $</w:t>
             </w:r>
             <w:r>
               <w:rPr>
@@ -1769,9 +1652,6 @@
           <w:p>
             <w:pPr>
               <w:pStyle w:val="Standard"/>
-              <w:bidi w:val="0"/>
-              <w:ind w:left="0" w:right="0" w:firstLine="0"/>
-              <w:jc w:val="left"/>
               <w:rPr>
                 <w:rFonts w:ascii="Arial" w:cs="Arial" w:hAnsi="Arial" w:eastAsia="Arial"/>
                 <w:b w:val="1"/>
@@ -1781,7 +1661,6 @@
                 <w:sz w:val="18"/>
                 <w:szCs w:val="18"/>
                 <w:shd w:val="nil" w:color="auto" w:fill="auto"/>
-                <w:rtl w:val="0"/>
               </w:rPr>
             </w:pPr>
             <w:r>
@@ -1814,7 +1693,6 @@
                 <w:szCs w:val="18"/>
                 <w:shd w:val="nil" w:color="auto" w:fill="auto"/>
                 <w:rtl w:val="0"/>
-                <w:lang w:val="de-DE"/>
               </w:rPr>
             </w:pPr>
             <w:r>
@@ -1834,16 +1712,14 @@
           <w:p>
             <w:pPr>
               <w:pStyle w:val="Standard"/>
-              <w:bidi w:val="0"/>
-              <w:ind w:left="0" w:right="0" w:firstLine="0"/>
-              <w:jc w:val="left"/>
               <w:rPr>
                 <w:rFonts w:ascii="Arial" w:cs="Arial" w:hAnsi="Arial" w:eastAsia="Arial"/>
                 <w:b w:val="1"/>
                 <w:bCs w:val="1"/>
                 <w:sz w:val="18"/>
                 <w:szCs w:val="18"/>
-                <w:rtl w:val="0"/>
+                <w:shd w:val="nil" w:color="auto" w:fill="auto"/>
+                <w:lang w:val="de-DE"/>
               </w:rPr>
             </w:pPr>
           </w:p>
@@ -1960,7 +1836,7 @@
         </w:tc>
         <w:tc>
           <w:tcPr>
-            <w:tcW w:type="dxa" w:w="1095"/>
+            <w:tcW w:type="dxa" w:w="1096"/>
             <w:tcBorders>
               <w:top w:val="single" w:color="ffffff" w:sz="4" w:space="0" w:shadow="0" w:frame="0"/>
               <w:left w:val="single" w:color="ffffff" w:sz="4" w:space="0" w:shadow="0" w:frame="0"/>
@@ -1979,10 +1855,7 @@
           <w:p>
             <w:pPr>
               <w:pStyle w:val="AB"/>
-              <w:bidi w:val="0"/>
               <w:spacing w:line="240" w:lineRule="auto"/>
-              <w:ind w:left="0" w:right="0" w:firstLine="0"/>
-              <w:jc w:val="left"/>
               <w:rPr>
                 <w:rFonts w:ascii="Arial" w:cs="Arial" w:hAnsi="Arial" w:eastAsia="Arial"/>
                 <w:b w:val="1"/>
@@ -1990,7 +1863,40 @@
                 <w:sz w:val="18"/>
                 <w:szCs w:val="18"/>
                 <w:u w:color="ff0000"/>
-                <w:rtl w:val="0"/>
+                <w:shd w:val="nil" w:color="auto" w:fill="auto"/>
+                <w:lang w:val="de-DE"/>
+              </w:rPr>
+            </w:pPr>
+          </w:p>
+          <w:p>
+            <w:pPr>
+              <w:pStyle w:val="AB"/>
+              <w:spacing w:line="240" w:lineRule="auto"/>
+              <w:rPr>
+                <w:rFonts w:ascii="Arial" w:cs="Arial" w:hAnsi="Arial" w:eastAsia="Arial"/>
+                <w:b w:val="1"/>
+                <w:bCs w:val="1"/>
+                <w:sz w:val="18"/>
+                <w:szCs w:val="18"/>
+                <w:u w:color="ff0000"/>
+                <w:shd w:val="nil" w:color="auto" w:fill="auto"/>
+                <w:lang w:val="de-DE"/>
+              </w:rPr>
+            </w:pPr>
+          </w:p>
+          <w:p>
+            <w:pPr>
+              <w:pStyle w:val="AB"/>
+              <w:spacing w:line="240" w:lineRule="auto"/>
+              <w:rPr>
+                <w:rFonts w:ascii="Arial" w:cs="Arial" w:hAnsi="Arial" w:eastAsia="Arial"/>
+                <w:b w:val="1"/>
+                <w:bCs w:val="1"/>
+                <w:sz w:val="18"/>
+                <w:szCs w:val="18"/>
+                <w:u w:color="ff0000"/>
+                <w:shd w:val="nil" w:color="auto" w:fill="auto"/>
+                <w:lang w:val="de-DE"/>
               </w:rPr>
             </w:pPr>
           </w:p>
@@ -2008,7 +1914,38 @@
                 <w:sz w:val="18"/>
                 <w:szCs w:val="18"/>
                 <w:u w:color="ff0000"/>
-                <w:rtl w:val="0"/>
+                <w:shd w:val="nil" w:color="auto" w:fill="auto"/>
+                <w:rtl w:val="0"/>
+              </w:rPr>
+            </w:pPr>
+            <w:r>
+              <w:rPr>
+                <w:rFonts w:ascii="Arial" w:hAnsi="Arial"/>
+                <w:b w:val="1"/>
+                <w:bCs w:val="1"/>
+                <w:sz w:val="18"/>
+                <w:szCs w:val="18"/>
+                <w:u w:color="ff0000"/>
+                <w:shd w:val="nil" w:color="auto" w:fill="auto"/>
+                <w:rtl w:val="0"/>
+                <w:lang w:val="en-US"/>
+              </w:rPr>
+              <w:t>${start}</w:t>
+            </w:r>
+          </w:p>
+          <w:p>
+            <w:pPr>
+              <w:pStyle w:val="AB"/>
+              <w:spacing w:line="240" w:lineRule="auto"/>
+              <w:rPr>
+                <w:rFonts w:ascii="Arial" w:cs="Arial" w:hAnsi="Arial" w:eastAsia="Arial"/>
+                <w:b w:val="1"/>
+                <w:bCs w:val="1"/>
+                <w:sz w:val="18"/>
+                <w:szCs w:val="18"/>
+                <w:u w:color="ff0000"/>
+                <w:shd w:val="nil" w:color="auto" w:fill="auto"/>
+                <w:lang w:val="de-DE"/>
               </w:rPr>
             </w:pPr>
           </w:p>
@@ -2020,117 +1957,22 @@
               <w:ind w:left="0" w:right="0" w:firstLine="0"/>
               <w:jc w:val="left"/>
               <w:rPr>
-                <w:rFonts w:ascii="Arial" w:cs="Arial" w:hAnsi="Arial" w:eastAsia="Arial"/>
+                <w:rtl w:val="0"/>
+              </w:rPr>
+            </w:pPr>
+            <w:r>
+              <w:rPr>
+                <w:rFonts w:ascii="Arial" w:hAnsi="Arial"/>
                 <w:b w:val="1"/>
                 <w:bCs w:val="1"/>
                 <w:sz w:val="18"/>
                 <w:szCs w:val="18"/>
                 <w:u w:color="ff0000"/>
-                <w:rtl w:val="0"/>
-              </w:rPr>
-            </w:pPr>
-          </w:p>
-          <w:p>
-            <w:pPr>
-              <w:pStyle w:val="AB"/>
-              <w:bidi w:val="0"/>
-              <w:spacing w:line="240" w:lineRule="auto"/>
-              <w:ind w:left="0" w:right="0" w:firstLine="0"/>
-              <w:jc w:val="left"/>
-              <w:rPr>
-                <w:rFonts w:ascii="Arial" w:cs="Arial" w:hAnsi="Arial" w:eastAsia="Arial"/>
-                <w:b w:val="1"/>
-                <w:bCs w:val="1"/>
-                <w:sz w:val="18"/>
-                <w:szCs w:val="18"/>
-                <w:u w:color="ff0000"/>
-                <w:shd w:val="nil" w:color="auto" w:fill="auto"/>
-                <w:rtl w:val="0"/>
-              </w:rPr>
-            </w:pPr>
-            <w:r>
-              <w:rPr>
-                <w:rFonts w:ascii="Arial" w:hAnsi="Arial"/>
-                <w:b w:val="1"/>
-                <w:bCs w:val="1"/>
-                <w:sz w:val="18"/>
-                <w:szCs w:val="18"/>
-                <w:u w:color="ff0000"/>
                 <w:shd w:val="nil" w:color="auto" w:fill="auto"/>
                 <w:rtl w:val="0"/>
                 <w:lang w:val="en-US"/>
               </w:rPr>
-              <w:t>$</w:t>
-            </w:r>
-            <w:r>
-              <w:rPr>
-                <w:rFonts w:ascii="Arial" w:hAnsi="Arial"/>
-                <w:b w:val="1"/>
-                <w:bCs w:val="1"/>
-                <w:sz w:val="18"/>
-                <w:szCs w:val="18"/>
-                <w:u w:color="ff0000"/>
-                <w:shd w:val="nil" w:color="auto" w:fill="auto"/>
-                <w:rtl w:val="0"/>
-                <w:lang w:val="en-US"/>
-              </w:rPr>
-              <w:t>{start}</w:t>
-            </w:r>
-          </w:p>
-          <w:p>
-            <w:pPr>
-              <w:pStyle w:val="AB"/>
-              <w:spacing w:line="240" w:lineRule="auto"/>
-              <w:rPr>
-                <w:rFonts w:ascii="Arial" w:cs="Arial" w:hAnsi="Arial" w:eastAsia="Arial"/>
-                <w:b w:val="1"/>
-                <w:bCs w:val="1"/>
-                <w:sz w:val="18"/>
-                <w:szCs w:val="18"/>
-                <w:u w:color="ff0000"/>
-                <w:shd w:val="nil" w:color="auto" w:fill="auto"/>
-                <w:lang w:val="de-DE"/>
-              </w:rPr>
-            </w:pPr>
-          </w:p>
-          <w:p>
-            <w:pPr>
-              <w:pStyle w:val="AB"/>
-              <w:bidi w:val="0"/>
-              <w:spacing w:line="240" w:lineRule="auto"/>
-              <w:ind w:left="0" w:right="0" w:firstLine="0"/>
-              <w:jc w:val="left"/>
-              <w:rPr>
-                <w:rtl w:val="0"/>
-              </w:rPr>
-            </w:pPr>
-            <w:r>
-              <w:rPr>
-                <w:rFonts w:ascii="Arial" w:hAnsi="Arial"/>
-                <w:b w:val="1"/>
-                <w:bCs w:val="1"/>
-                <w:sz w:val="18"/>
-                <w:szCs w:val="18"/>
-                <w:u w:color="ff0000"/>
-                <w:shd w:val="nil" w:color="auto" w:fill="auto"/>
-                <w:rtl w:val="0"/>
-                <w:lang w:val="en-US"/>
-              </w:rPr>
-              <w:t>$</w:t>
-            </w:r>
-            <w:r>
-              <w:rPr>
-                <w:rFonts w:ascii="Arial" w:hAnsi="Arial"/>
-                <w:b w:val="1"/>
-                <w:bCs w:val="1"/>
-                <w:sz w:val="18"/>
-                <w:szCs w:val="18"/>
-                <w:u w:color="ff0000"/>
-                <w:shd w:val="nil" w:color="auto" w:fill="auto"/>
-                <w:rtl w:val="0"/>
-                <w:lang w:val="en-US"/>
-              </w:rPr>
-              <w:t>{end}</w:t>
+              <w:t>${end}</w:t>
             </w:r>
           </w:p>
         </w:tc>
@@ -2140,7 +1982,7 @@
           <w:shd w:val="clear" w:color="auto" w:fill="ced7e7"/>
         </w:tblPrEx>
         <w:trPr>
-          <w:trHeight w:val="1425" w:hRule="atLeast"/>
+          <w:trHeight w:val="1445" w:hRule="atLeast"/>
         </w:trPr>
         <w:tc>
           <w:tcPr>
@@ -2348,6 +2190,7 @@
               <w:rPr>
                 <w:sz w:val="16"/>
                 <w:szCs w:val="16"/>
+                <w:shd w:val="nil" w:color="auto" w:fill="auto"/>
                 <w:rtl w:val="0"/>
                 <w:lang w:val="en-US"/>
               </w:rPr>
@@ -2407,6 +2250,7 @@
               <w:rPr>
                 <w:sz w:val="16"/>
                 <w:szCs w:val="16"/>
+                <w:shd w:val="nil" w:color="auto" w:fill="auto"/>
                 <w:rtl w:val="0"/>
                 <w:lang w:val="en-US"/>
               </w:rPr>
@@ -2449,7 +2293,7 @@
         </w:tc>
         <w:tc>
           <w:tcPr>
-            <w:tcW w:type="dxa" w:w="2605"/>
+            <w:tcW w:type="dxa" w:w="2606"/>
             <w:gridSpan w:val="2"/>
             <w:tcBorders>
               <w:top w:val="single" w:color="525252" w:sz="4" w:space="0" w:shadow="0" w:frame="0"/>
@@ -2552,9 +2396,40 @@
                 <w:rtl w:val="0"/>
                 <w:lang w:val="it-IT"/>
               </w:rPr>
-              <w:t xml:space="preserve">chst:  </w:t>
-              <w:tab/>
+              <w:t>chst:</w:t>
+            </w:r>
+            <w:r>
+              <w:rPr>
+                <w:rFonts w:ascii="Arial" w:hAnsi="Arial"/>
+                <w:sz w:val="16"/>
+                <w:szCs w:val="16"/>
+                <w:shd w:val="nil" w:color="auto" w:fill="auto"/>
+                <w:rtl w:val="0"/>
+                <w:lang w:val="en-US"/>
+              </w:rPr>
+              <w:t xml:space="preserve"> ${hoch} </w:t>
+            </w:r>
+            <w:r>
+              <w:rPr>
+                <w:rFonts w:ascii="Arial" w:hAnsi="Arial"/>
+                <w:sz w:val="16"/>
+                <w:szCs w:val="16"/>
+                <w:shd w:val="nil" w:color="auto" w:fill="auto"/>
+                <w:rtl w:val="0"/>
+                <w:lang w:val="it-IT"/>
+              </w:rPr>
               <w:t>Tiefst:</w:t>
+            </w:r>
+            <w:r>
+              <w:rPr>
+                <w:rFonts w:ascii="Arial" w:hAnsi="Arial"/>
+                <w:sz w:val="16"/>
+                <w:szCs w:val="16"/>
+                <w:shd w:val="nil" w:color="auto" w:fill="auto"/>
+                <w:rtl w:val="0"/>
+                <w:lang w:val="en-US"/>
+              </w:rPr>
+              <w:t xml:space="preserve"> ${tief}</w:t>
             </w:r>
           </w:p>
           <w:p>
@@ -2583,6 +2458,17 @@
               </w:rPr>
               <w:t>Wind:</w:t>
             </w:r>
+            <w:r>
+              <w:rPr>
+                <w:rFonts w:ascii="Arial" w:hAnsi="Arial"/>
+                <w:sz w:val="16"/>
+                <w:szCs w:val="16"/>
+                <w:shd w:val="nil" w:color="auto" w:fill="auto"/>
+                <w:rtl w:val="0"/>
+                <w:lang w:val="en-US"/>
+              </w:rPr>
+              <w:t xml:space="preserve"> ${wind}</w:t>
+            </w:r>
           </w:p>
           <w:p>
             <w:pPr>
@@ -2610,6 +2496,28 @@
               </w:rPr>
               <w:t>Sonne max.:</w:t>
             </w:r>
+            <w:r>
+              <w:rPr>
+                <w:rFonts w:ascii="Arial" w:hAnsi="Arial"/>
+                <w:sz w:val="16"/>
+                <w:szCs w:val="16"/>
+                <w:shd w:val="nil" w:color="auto" w:fill="auto"/>
+                <w:rtl w:val="0"/>
+                <w:lang w:val="en-US"/>
+              </w:rPr>
+              <w:t xml:space="preserve"> </w:t>
+            </w:r>
+            <w:r>
+              <w:rPr>
+                <w:rFonts w:ascii="Arial" w:hAnsi="Arial"/>
+                <w:sz w:val="16"/>
+                <w:szCs w:val="16"/>
+                <w:shd w:val="nil" w:color="auto" w:fill="auto"/>
+                <w:rtl w:val="0"/>
+                <w:lang w:val="it-IT"/>
+              </w:rPr>
+              <w:t>${sonne_max}</w:t>
+            </w:r>
           </w:p>
           <w:p>
             <w:pPr>
@@ -2642,12 +2550,43 @@
                 <w:rtl w:val="0"/>
                 <w:lang w:val="en-US"/>
               </w:rPr>
+              <w:t xml:space="preserve"> ${regen%}</w:t>
+            </w:r>
+            <w:r>
+              <w:rPr>
+                <w:rFonts w:ascii="Arial" w:hAnsi="Arial"/>
+                <w:sz w:val="16"/>
+                <w:szCs w:val="16"/>
+                <w:shd w:val="nil" w:color="auto" w:fill="auto"/>
+                <w:rtl w:val="0"/>
+                <w:lang w:val="en-US"/>
+              </w:rPr>
               <w:t xml:space="preserve"> </w:t>
             </w:r>
           </w:p>
         </w:tc>
       </w:tr>
     </w:tbl>
+    <w:p>
+      <w:pPr>
+        <w:pStyle w:val="Standard"/>
+        <w:widowControl w:val="0"/>
+        <w:ind w:left="394" w:hanging="394"/>
+        <w:rPr>
+          <w:rFonts w:ascii="Arial" w:cs="Arial" w:hAnsi="Arial" w:eastAsia="Arial"/>
+          <w:outline w:val="0"/>
+          <w:color w:val="ff0000"/>
+          <w:sz w:val="10"/>
+          <w:szCs w:val="10"/>
+          <w:u w:color="ff0000"/>
+          <w14:textFill>
+            <w14:solidFill>
+              <w14:srgbClr w14:val="FF0000"/>
+            </w14:solidFill>
+          </w14:textFill>
+        </w:rPr>
+      </w:pPr>
+    </w:p>
     <w:p>
       <w:pPr>
         <w:pStyle w:val="Standard"/>
@@ -2769,7 +2708,7 @@
       <w:tblPr>
         <w:tblW w:w="9867" w:type="dxa"/>
         <w:jc w:val="left"/>
-        <w:tblInd w:w="630" w:type="dxa"/>
+        <w:tblInd w:w="738" w:type="dxa"/>
         <w:tblBorders>
           <w:top w:val="single" w:color="ffffff" w:sz="8" w:space="0" w:shadow="0" w:frame="0"/>
           <w:left w:val="single" w:color="ffffff" w:sz="8" w:space="0" w:shadow="0" w:frame="0"/>
@@ -2790,7 +2729,7 @@
           <w:shd w:val="clear" w:color="auto" w:fill="ced7e7"/>
         </w:tblPrEx>
         <w:trPr>
-          <w:trHeight w:val="277" w:hRule="atLeast"/>
+          <w:trHeight w:val="287" w:hRule="atLeast"/>
         </w:trPr>
         <w:tc>
           <w:tcPr>
@@ -2836,7 +2775,7 @@
           <w:shd w:val="clear" w:color="auto" w:fill="ced7e7"/>
         </w:tblPrEx>
         <w:trPr>
-          <w:trHeight w:val="506" w:hRule="atLeast"/>
+          <w:trHeight w:val="516" w:hRule="atLeast"/>
         </w:trPr>
         <w:tc>
           <w:tcPr>
@@ -2864,6 +2803,7 @@
             </w:pPr>
             <w:r>
               <w:rPr>
+                <w:shd w:val="nil" w:color="auto" w:fill="auto"/>
                 <w:rtl w:val="0"/>
                 <w:lang w:val="en-US"/>
               </w:rPr>
@@ -2906,7 +2846,7 @@
           <w:shd w:val="clear" w:color="auto" w:fill="ced7e7"/>
         </w:tblPrEx>
         <w:trPr>
-          <w:trHeight w:val="310" w:hRule="atLeast"/>
+          <w:trHeight w:val="320" w:hRule="atLeast"/>
         </w:trPr>
         <w:tc>
           <w:tcPr>
@@ -2954,7 +2894,7 @@
           <w:shd w:val="clear" w:color="auto" w:fill="ced7e7"/>
         </w:tblPrEx>
         <w:trPr>
-          <w:trHeight w:val="310" w:hRule="atLeast"/>
+          <w:trHeight w:val="320" w:hRule="atLeast"/>
         </w:trPr>
         <w:tc>
           <w:tcPr>
@@ -3002,7 +2942,7 @@
           <w:shd w:val="clear" w:color="auto" w:fill="ced7e7"/>
         </w:tblPrEx>
         <w:trPr>
-          <w:trHeight w:val="310" w:hRule="atLeast"/>
+          <w:trHeight w:val="320" w:hRule="atLeast"/>
         </w:trPr>
         <w:tc>
           <w:tcPr>
@@ -3050,7 +2990,7 @@
           <w:shd w:val="clear" w:color="auto" w:fill="ced7e7"/>
         </w:tblPrEx>
         <w:trPr>
-          <w:trHeight w:val="506" w:hRule="atLeast"/>
+          <w:trHeight w:val="516" w:hRule="atLeast"/>
         </w:trPr>
         <w:tc>
           <w:tcPr>
@@ -3078,6 +3018,7 @@
             </w:pPr>
             <w:r>
               <w:rPr>
+                <w:shd w:val="nil" w:color="auto" w:fill="auto"/>
                 <w:rtl w:val="0"/>
                 <w:lang w:val="en-US"/>
               </w:rPr>
@@ -3134,6 +3075,27 @@
         </w:tc>
       </w:tr>
     </w:tbl>
+    <w:p>
+      <w:pPr>
+        <w:pStyle w:val="Standard"/>
+        <w:widowControl w:val="0"/>
+        <w:ind w:left="630" w:hanging="630"/>
+        <w:rPr>
+          <w:b w:val="1"/>
+          <w:bCs w:val="1"/>
+          <w:outline w:val="0"/>
+          <w:color w:val="ff0000"/>
+          <w:sz w:val="18"/>
+          <w:szCs w:val="18"/>
+          <w:u w:color="ff0000"/>
+          <w14:textFill>
+            <w14:solidFill>
+              <w14:srgbClr w14:val="FF0000"/>
+            </w14:solidFill>
+          </w14:textFill>
+        </w:rPr>
+      </w:pPr>
+    </w:p>
     <w:p>
       <w:pPr>
         <w:pStyle w:val="Standard"/>
@@ -3315,7 +3277,7 @@
       <w:tblPr>
         <w:tblW w:w="10260" w:type="dxa"/>
         <w:jc w:val="left"/>
-        <w:tblInd w:w="354" w:type="dxa"/>
+        <w:tblInd w:w="462" w:type="dxa"/>
         <w:tblBorders>
           <w:top w:val="single" w:color="ffffff" w:sz="8" w:space="0" w:shadow="0" w:frame="0"/>
           <w:left w:val="single" w:color="ffffff" w:sz="8" w:space="0" w:shadow="0" w:frame="0"/>
@@ -3336,7 +3298,7 @@
           <w:shd w:val="clear" w:color="auto" w:fill="ced7e7"/>
         </w:tblPrEx>
         <w:trPr>
-          <w:trHeight w:val="310" w:hRule="atLeast"/>
+          <w:trHeight w:val="320" w:hRule="atLeast"/>
         </w:trPr>
         <w:tc>
           <w:tcPr>
@@ -3396,7 +3358,7 @@
           <w:shd w:val="clear" w:color="auto" w:fill="ced7e7"/>
         </w:tblPrEx>
         <w:trPr>
-          <w:trHeight w:val="310" w:hRule="atLeast"/>
+          <w:trHeight w:val="320" w:hRule="atLeast"/>
         </w:trPr>
         <w:tc>
           <w:tcPr>
@@ -3461,7 +3423,7 @@
           <w:shd w:val="clear" w:color="auto" w:fill="ced7e7"/>
         </w:tblPrEx>
         <w:trPr>
-          <w:trHeight w:val="424" w:hRule="atLeast"/>
+          <w:trHeight w:val="434" w:hRule="atLeast"/>
         </w:trPr>
         <w:tc>
           <w:tcPr>
@@ -3472,7 +3434,7 @@
               <w:bottom w:val="single" w:color="000000" w:sz="4" w:space="0" w:shadow="0" w:frame="0"/>
               <w:right w:val="single" w:color="000000" w:sz="4" w:space="0" w:shadow="0" w:frame="0"/>
             </w:tcBorders>
-            <w:shd w:val="clear" w:color="auto" w:fill="ffffff"/>
+            <w:shd w:val="clear" w:color="auto" w:fill="auto"/>
             <w:tcMar>
               <w:top w:type="dxa" w:w="80"/>
               <w:left w:type="dxa" w:w="80"/>
@@ -3509,7 +3471,7 @@
               <w:bottom w:val="single" w:color="000000" w:sz="4" w:space="0" w:shadow="0" w:frame="0"/>
               <w:right w:val="single" w:color="000000" w:sz="4" w:space="0" w:shadow="0" w:frame="0"/>
             </w:tcBorders>
-            <w:shd w:val="clear" w:color="auto" w:fill="ffffff"/>
+            <w:shd w:val="clear" w:color="auto" w:fill="auto"/>
             <w:tcMar>
               <w:top w:type="dxa" w:w="80"/>
               <w:left w:type="dxa" w:w="80"/>
@@ -3526,7 +3488,7 @@
           <w:shd w:val="clear" w:color="auto" w:fill="ced7e7"/>
         </w:tblPrEx>
         <w:trPr>
-          <w:trHeight w:val="310" w:hRule="atLeast"/>
+          <w:trHeight w:val="320" w:hRule="atLeast"/>
         </w:trPr>
         <w:tc>
           <w:tcPr>
@@ -3537,7 +3499,7 @@
               <w:bottom w:val="single" w:color="000000" w:sz="4" w:space="0" w:shadow="0" w:frame="0"/>
               <w:right w:val="single" w:color="000000" w:sz="4" w:space="0" w:shadow="0" w:frame="0"/>
             </w:tcBorders>
-            <w:shd w:val="clear" w:color="auto" w:fill="ffffff"/>
+            <w:shd w:val="clear" w:color="auto" w:fill="auto"/>
             <w:tcMar>
               <w:top w:type="dxa" w:w="80"/>
               <w:left w:type="dxa" w:w="80"/>
@@ -3587,6 +3549,27 @@
         </w:tc>
       </w:tr>
     </w:tbl>
+    <w:p>
+      <w:pPr>
+        <w:pStyle w:val="Standard"/>
+        <w:widowControl w:val="0"/>
+        <w:ind w:left="354" w:hanging="354"/>
+        <w:rPr>
+          <w:b w:val="1"/>
+          <w:bCs w:val="1"/>
+          <w:outline w:val="0"/>
+          <w:color w:val="ff0000"/>
+          <w:sz w:val="10"/>
+          <w:szCs w:val="10"/>
+          <w:u w:color="ff0000"/>
+          <w14:textFill>
+            <w14:solidFill>
+              <w14:srgbClr w14:val="FF0000"/>
+            </w14:solidFill>
+          </w14:textFill>
+        </w:rPr>
+      </w:pPr>
+    </w:p>
     <w:p>
       <w:pPr>
         <w:pStyle w:val="Standard"/>

</xml_diff>

<commit_message>
Create the call sheet by event
</commit_message>
<xml_diff>
--- a/templates/doc_template.docx
+++ b/templates/doc_template.docx
@@ -47,7 +47,7 @@
               <wp:posOffset>-634</wp:posOffset>
             </wp:positionH>
             <wp:positionV relativeFrom="line">
-              <wp:posOffset>20951</wp:posOffset>
+              <wp:posOffset>20950</wp:posOffset>
             </wp:positionV>
             <wp:extent cx="1098551" cy="981076"/>
             <wp:effectExtent l="0" t="0" r="0" b="0"/>
@@ -754,7 +754,31 @@
           <w:rtl w:val="0"/>
           <w:lang w:val="en-US"/>
         </w:rPr>
-        <w:t>{datum}</w:t>
+        <w:t>{datum</w:t>
+      </w:r>
+      <w:r>
+        <w:rPr>
+          <w:b w:val="0"/>
+          <w:bCs w:val="0"/>
+          <w:sz w:val="24"/>
+          <w:szCs w:val="24"/>
+          <w:u w:color="ff0000"/>
+          <w:rtl w:val="0"/>
+          <w:lang w:val="en-US"/>
+        </w:rPr>
+        <w:t>_beginn</w:t>
+      </w:r>
+      <w:r>
+        <w:rPr>
+          <w:b w:val="0"/>
+          <w:bCs w:val="0"/>
+          <w:sz w:val="24"/>
+          <w:szCs w:val="24"/>
+          <w:u w:color="ff0000"/>
+          <w:rtl w:val="0"/>
+          <w:lang w:val="en-US"/>
+        </w:rPr>
+        <w:t>}</w:t>
       </w:r>
     </w:p>
     <w:p>
@@ -780,7 +804,7 @@
       <w:tblPr>
         <w:tblW w:w="9902" w:type="dxa"/>
         <w:jc w:val="left"/>
-        <w:tblInd w:w="502" w:type="dxa"/>
+        <w:tblInd w:w="610" w:type="dxa"/>
         <w:tblBorders>
           <w:top w:val="single" w:color="ffffff" w:sz="8" w:space="0" w:shadow="0" w:frame="0"/>
           <w:left w:val="single" w:color="ffffff" w:sz="8" w:space="0" w:shadow="0" w:frame="0"/>
@@ -803,7 +827,7 @@
           <w:shd w:val="clear" w:color="auto" w:fill="ced7e7"/>
         </w:tblPrEx>
         <w:trPr>
-          <w:trHeight w:val="350" w:hRule="atLeast"/>
+          <w:trHeight w:val="370" w:hRule="atLeast"/>
         </w:trPr>
         <w:tc>
           <w:tcPr>
@@ -889,7 +913,7 @@
           <w:shd w:val="clear" w:color="auto" w:fill="ced7e7"/>
         </w:tblPrEx>
         <w:trPr>
-          <w:trHeight w:val="634" w:hRule="atLeast"/>
+          <w:trHeight w:val="654" w:hRule="atLeast"/>
         </w:trPr>
         <w:tc>
           <w:tcPr>
@@ -1154,7 +1178,7 @@
           <w:shd w:val="clear" w:color="auto" w:fill="ced7e7"/>
         </w:tblPrEx>
         <w:trPr>
-          <w:trHeight w:val="600" w:hRule="atLeast"/>
+          <w:trHeight w:val="620" w:hRule="atLeast"/>
         </w:trPr>
         <w:tc>
           <w:tcPr>
@@ -1354,7 +1378,7 @@
           <w:shd w:val="clear" w:color="auto" w:fill="ced7e7"/>
         </w:tblPrEx>
         <w:trPr>
-          <w:trHeight w:val="2054" w:hRule="atLeast"/>
+          <w:trHeight w:val="2074" w:hRule="atLeast"/>
         </w:trPr>
         <w:tc>
           <w:tcPr>
@@ -1982,7 +2006,7 @@
           <w:shd w:val="clear" w:color="auto" w:fill="ced7e7"/>
         </w:tblPrEx>
         <w:trPr>
-          <w:trHeight w:val="1445" w:hRule="atLeast"/>
+          <w:trHeight w:val="1465" w:hRule="atLeast"/>
         </w:trPr>
         <w:tc>
           <w:tcPr>
@@ -2550,23 +2574,32 @@
                 <w:rtl w:val="0"/>
                 <w:lang w:val="en-US"/>
               </w:rPr>
-              <w:t xml:space="preserve"> ${regen%}</w:t>
-            </w:r>
-            <w:r>
-              <w:rPr>
-                <w:rFonts w:ascii="Arial" w:hAnsi="Arial"/>
-                <w:sz w:val="16"/>
-                <w:szCs w:val="16"/>
-                <w:shd w:val="nil" w:color="auto" w:fill="auto"/>
-                <w:rtl w:val="0"/>
-                <w:lang w:val="en-US"/>
-              </w:rPr>
-              <w:t xml:space="preserve"> </w:t>
+              <w:t xml:space="preserve"> ${regen%} </w:t>
             </w:r>
           </w:p>
         </w:tc>
       </w:tr>
     </w:tbl>
+    <w:p>
+      <w:pPr>
+        <w:pStyle w:val="Standard"/>
+        <w:widowControl w:val="0"/>
+        <w:ind w:left="502" w:hanging="502"/>
+        <w:rPr>
+          <w:rFonts w:ascii="Arial" w:cs="Arial" w:hAnsi="Arial" w:eastAsia="Arial"/>
+          <w:outline w:val="0"/>
+          <w:color w:val="ff0000"/>
+          <w:sz w:val="10"/>
+          <w:szCs w:val="10"/>
+          <w:u w:color="ff0000"/>
+          <w14:textFill>
+            <w14:solidFill>
+              <w14:srgbClr w14:val="FF0000"/>
+            </w14:solidFill>
+          </w14:textFill>
+        </w:rPr>
+      </w:pPr>
+    </w:p>
     <w:p>
       <w:pPr>
         <w:pStyle w:val="Standard"/>
@@ -2708,7 +2741,7 @@
       <w:tblPr>
         <w:tblW w:w="9867" w:type="dxa"/>
         <w:jc w:val="left"/>
-        <w:tblInd w:w="738" w:type="dxa"/>
+        <w:tblInd w:w="846" w:type="dxa"/>
         <w:tblBorders>
           <w:top w:val="single" w:color="ffffff" w:sz="8" w:space="0" w:shadow="0" w:frame="0"/>
           <w:left w:val="single" w:color="ffffff" w:sz="8" w:space="0" w:shadow="0" w:frame="0"/>
@@ -2729,7 +2762,7 @@
           <w:shd w:val="clear" w:color="auto" w:fill="ced7e7"/>
         </w:tblPrEx>
         <w:trPr>
-          <w:trHeight w:val="287" w:hRule="atLeast"/>
+          <w:trHeight w:val="297" w:hRule="atLeast"/>
         </w:trPr>
         <w:tc>
           <w:tcPr>
@@ -2775,7 +2808,7 @@
           <w:shd w:val="clear" w:color="auto" w:fill="ced7e7"/>
         </w:tblPrEx>
         <w:trPr>
-          <w:trHeight w:val="516" w:hRule="atLeast"/>
+          <w:trHeight w:val="526" w:hRule="atLeast"/>
         </w:trPr>
         <w:tc>
           <w:tcPr>
@@ -2846,7 +2879,7 @@
           <w:shd w:val="clear" w:color="auto" w:fill="ced7e7"/>
         </w:tblPrEx>
         <w:trPr>
-          <w:trHeight w:val="320" w:hRule="atLeast"/>
+          <w:trHeight w:val="330" w:hRule="atLeast"/>
         </w:trPr>
         <w:tc>
           <w:tcPr>
@@ -2894,7 +2927,7 @@
           <w:shd w:val="clear" w:color="auto" w:fill="ced7e7"/>
         </w:tblPrEx>
         <w:trPr>
-          <w:trHeight w:val="320" w:hRule="atLeast"/>
+          <w:trHeight w:val="330" w:hRule="atLeast"/>
         </w:trPr>
         <w:tc>
           <w:tcPr>
@@ -2942,7 +2975,7 @@
           <w:shd w:val="clear" w:color="auto" w:fill="ced7e7"/>
         </w:tblPrEx>
         <w:trPr>
-          <w:trHeight w:val="320" w:hRule="atLeast"/>
+          <w:trHeight w:val="330" w:hRule="atLeast"/>
         </w:trPr>
         <w:tc>
           <w:tcPr>
@@ -2990,7 +3023,7 @@
           <w:shd w:val="clear" w:color="auto" w:fill="ced7e7"/>
         </w:tblPrEx>
         <w:trPr>
-          <w:trHeight w:val="516" w:hRule="atLeast"/>
+          <w:trHeight w:val="526" w:hRule="atLeast"/>
         </w:trPr>
         <w:tc>
           <w:tcPr>
@@ -3062,7 +3095,7 @@
               <w:bottom w:val="single" w:color="000000" w:sz="4" w:space="0" w:shadow="0" w:frame="0"/>
               <w:right w:val="single" w:color="000000" w:sz="4" w:space="0" w:shadow="0" w:frame="0"/>
             </w:tcBorders>
-            <w:shd w:val="clear" w:color="auto" w:fill="ffffff"/>
+            <w:shd w:val="clear" w:color="auto" w:fill="auto"/>
             <w:tcMar>
               <w:top w:type="dxa" w:w="80"/>
               <w:left w:type="dxa" w:w="80"/>
@@ -3075,6 +3108,27 @@
         </w:tc>
       </w:tr>
     </w:tbl>
+    <w:p>
+      <w:pPr>
+        <w:pStyle w:val="Standard"/>
+        <w:widowControl w:val="0"/>
+        <w:ind w:left="738" w:hanging="738"/>
+        <w:rPr>
+          <w:b w:val="1"/>
+          <w:bCs w:val="1"/>
+          <w:outline w:val="0"/>
+          <w:color w:val="ff0000"/>
+          <w:sz w:val="18"/>
+          <w:szCs w:val="18"/>
+          <w:u w:color="ff0000"/>
+          <w14:textFill>
+            <w14:solidFill>
+              <w14:srgbClr w14:val="FF0000"/>
+            </w14:solidFill>
+          </w14:textFill>
+        </w:rPr>
+      </w:pPr>
+    </w:p>
     <w:p>
       <w:pPr>
         <w:pStyle w:val="Standard"/>
@@ -3277,7 +3331,7 @@
       <w:tblPr>
         <w:tblW w:w="10260" w:type="dxa"/>
         <w:jc w:val="left"/>
-        <w:tblInd w:w="462" w:type="dxa"/>
+        <w:tblInd w:w="570" w:type="dxa"/>
         <w:tblBorders>
           <w:top w:val="single" w:color="ffffff" w:sz="8" w:space="0" w:shadow="0" w:frame="0"/>
           <w:left w:val="single" w:color="ffffff" w:sz="8" w:space="0" w:shadow="0" w:frame="0"/>
@@ -3298,7 +3352,7 @@
           <w:shd w:val="clear" w:color="auto" w:fill="ced7e7"/>
         </w:tblPrEx>
         <w:trPr>
-          <w:trHeight w:val="320" w:hRule="atLeast"/>
+          <w:trHeight w:val="330" w:hRule="atLeast"/>
         </w:trPr>
         <w:tc>
           <w:tcPr>
@@ -3358,7 +3412,7 @@
           <w:shd w:val="clear" w:color="auto" w:fill="ced7e7"/>
         </w:tblPrEx>
         <w:trPr>
-          <w:trHeight w:val="320" w:hRule="atLeast"/>
+          <w:trHeight w:val="330" w:hRule="atLeast"/>
         </w:trPr>
         <w:tc>
           <w:tcPr>
@@ -3423,7 +3477,7 @@
           <w:shd w:val="clear" w:color="auto" w:fill="ced7e7"/>
         </w:tblPrEx>
         <w:trPr>
-          <w:trHeight w:val="434" w:hRule="atLeast"/>
+          <w:trHeight w:val="444" w:hRule="atLeast"/>
         </w:trPr>
         <w:tc>
           <w:tcPr>
@@ -3488,7 +3542,7 @@
           <w:shd w:val="clear" w:color="auto" w:fill="ced7e7"/>
         </w:tblPrEx>
         <w:trPr>
-          <w:trHeight w:val="320" w:hRule="atLeast"/>
+          <w:trHeight w:val="330" w:hRule="atLeast"/>
         </w:trPr>
         <w:tc>
           <w:tcPr>
@@ -3536,7 +3590,7 @@
               <w:bottom w:val="single" w:color="000000" w:sz="4" w:space="0" w:shadow="0" w:frame="0"/>
               <w:right w:val="single" w:color="000000" w:sz="4" w:space="0" w:shadow="0" w:frame="0"/>
             </w:tcBorders>
-            <w:shd w:val="clear" w:color="auto" w:fill="ffffff"/>
+            <w:shd w:val="clear" w:color="auto" w:fill="auto"/>
             <w:tcMar>
               <w:top w:type="dxa" w:w="80"/>
               <w:left w:type="dxa" w:w="80"/>
@@ -3549,6 +3603,27 @@
         </w:tc>
       </w:tr>
     </w:tbl>
+    <w:p>
+      <w:pPr>
+        <w:pStyle w:val="Standard"/>
+        <w:widowControl w:val="0"/>
+        <w:ind w:left="462" w:hanging="462"/>
+        <w:rPr>
+          <w:b w:val="1"/>
+          <w:bCs w:val="1"/>
+          <w:outline w:val="0"/>
+          <w:color w:val="ff0000"/>
+          <w:sz w:val="10"/>
+          <w:szCs w:val="10"/>
+          <w:u w:color="ff0000"/>
+          <w14:textFill>
+            <w14:solidFill>
+              <w14:srgbClr w14:val="FF0000"/>
+            </w14:solidFill>
+          </w14:textFill>
+        </w:rPr>
+      </w:pPr>
+    </w:p>
     <w:p>
       <w:pPr>
         <w:pStyle w:val="Standard"/>

</xml_diff>